<commit_message>
feat: agregar campo userNameCreate
</commit_message>
<xml_diff>
--- a/pesaje/analytica/Report/PrintTicket.docx
+++ b/pesaje/analytica/Report/PrintTicket.docx
@@ -3939,7 +3939,7 @@
                 <w:sz w:val="16"/>
                 <w:szCs w:val="16"/>
               </w:rPr>
-              <w:instrText xml:space="preserve"> MERGEFIELD  nom_usuario  \* MERGEFORMAT </w:instrText>
+              <w:instrText xml:space="preserve"> MERGEFIELD  usu_create  \* MERGEFORMAT </w:instrText>
             </w:r>
             <w:r>
               <w:rPr>
@@ -3960,7 +3960,7 @@
                 <w:sz w:val="16"/>
                 <w:szCs w:val="16"/>
               </w:rPr>
-              <w:t>«nom_usuario»</w:t>
+              <w:t>«usu_create»</w:t>
             </w:r>
             <w:r>
               <w:rPr>

</xml_diff>

<commit_message>
feat: eliminar presentacion en plantilla de solicitud y muestras
</commit_message>
<xml_diff>
--- a/pesaje/analytica/Report/PrintTicket.docx
+++ b/pesaje/analytica/Report/PrintTicket.docx
@@ -782,7 +782,6 @@
                 <w:szCs w:val="16"/>
               </w:rPr>
             </w:pPr>
-            <w:proofErr w:type="gramStart"/>
             <w:r>
               <w:rPr>
                 <w:rFonts w:ascii="Arial" w:hAnsi="Arial"/>
@@ -792,33 +791,8 @@
                 <w:szCs w:val="16"/>
                 <w:lang w:val="es-PE"/>
               </w:rPr>
-              <w:t>Ticket</w:t>
-            </w:r>
-            <w:proofErr w:type="gramEnd"/>
-            <w:r>
-              <w:rPr>
-                <w:rFonts w:ascii="Arial" w:hAnsi="Arial"/>
-                <w:b/>
-                <w:color w:val="000000" w:themeColor="text1"/>
-                <w:sz w:val="16"/>
-                <w:szCs w:val="16"/>
-                <w:lang w:val="es-PE"/>
-              </w:rPr>
-              <w:t xml:space="preserve"> de Pesaje </w:t>
-            </w:r>
-            <w:proofErr w:type="spellStart"/>
-            <w:r>
-              <w:rPr>
-                <w:rFonts w:ascii="Arial" w:hAnsi="Arial"/>
-                <w:b/>
-                <w:color w:val="000000" w:themeColor="text1"/>
-                <w:sz w:val="16"/>
-                <w:szCs w:val="16"/>
-                <w:lang w:val="es-PE"/>
-              </w:rPr>
-              <w:t>N°</w:t>
-            </w:r>
-            <w:proofErr w:type="spellEnd"/>
+              <w:t>Ticket de Pesaje N°</w:t>
+            </w:r>
           </w:p>
         </w:tc>
         <w:tc>
@@ -2047,7 +2021,6 @@
                 <w:szCs w:val="16"/>
               </w:rPr>
             </w:pPr>
-            <w:proofErr w:type="spellStart"/>
             <w:r>
               <w:rPr>
                 <w:rFonts w:ascii="Arial" w:hAnsi="Arial"/>
@@ -2057,19 +2030,7 @@
                 <w:szCs w:val="16"/>
                 <w:lang w:val="es-PE"/>
               </w:rPr>
-              <w:t>N°</w:t>
-            </w:r>
-            <w:proofErr w:type="spellEnd"/>
-            <w:r>
-              <w:rPr>
-                <w:rFonts w:ascii="Arial" w:hAnsi="Arial"/>
-                <w:b/>
-                <w:color w:val="000000" w:themeColor="text1"/>
-                <w:sz w:val="16"/>
-                <w:szCs w:val="16"/>
-                <w:lang w:val="es-PE"/>
-              </w:rPr>
-              <w:t xml:space="preserve"> Doc / Guia R.</w:t>
+              <w:t>N° Doc / Guia R.</w:t>
             </w:r>
           </w:p>
         </w:tc>
@@ -2441,7 +2402,6 @@
                 <w:szCs w:val="16"/>
               </w:rPr>
             </w:pPr>
-            <w:proofErr w:type="spellStart"/>
             <w:r>
               <w:rPr>
                 <w:rFonts w:ascii="Arial" w:hAnsi="Arial"/>
@@ -2453,7 +2413,6 @@
               </w:rPr>
               <w:t>Producto</w:t>
             </w:r>
-            <w:proofErr w:type="spellEnd"/>
           </w:p>
         </w:tc>
         <w:tc>
@@ -2479,7 +2438,6 @@
                 <w:szCs w:val="16"/>
               </w:rPr>
             </w:pPr>
-            <w:proofErr w:type="spellStart"/>
             <w:r>
               <w:rPr>
                 <w:rFonts w:ascii="Arial" w:hAnsi="Arial"/>
@@ -2491,7 +2449,6 @@
               </w:rPr>
               <w:t>Procedencia</w:t>
             </w:r>
-            <w:proofErr w:type="spellEnd"/>
           </w:p>
         </w:tc>
         <w:tc>
@@ -2517,7 +2474,6 @@
                 <w:szCs w:val="16"/>
               </w:rPr>
             </w:pPr>
-            <w:proofErr w:type="spellStart"/>
             <w:r>
               <w:rPr>
                 <w:rFonts w:ascii="Arial" w:hAnsi="Arial"/>
@@ -2529,7 +2485,6 @@
               </w:rPr>
               <w:t>Envase</w:t>
             </w:r>
-            <w:proofErr w:type="spellEnd"/>
           </w:p>
         </w:tc>
         <w:tc>
@@ -2555,7 +2510,6 @@
                 <w:szCs w:val="16"/>
               </w:rPr>
             </w:pPr>
-            <w:proofErr w:type="spellStart"/>
             <w:r>
               <w:rPr>
                 <w:rFonts w:ascii="Arial" w:hAnsi="Arial"/>
@@ -2567,7 +2521,6 @@
               </w:rPr>
               <w:t>Cantidad</w:t>
             </w:r>
-            <w:proofErr w:type="spellEnd"/>
           </w:p>
         </w:tc>
         <w:tc>
@@ -3402,6 +3355,16 @@
               </w:rPr>
               <w:fldChar w:fldCharType="end"/>
             </w:r>
+            <w:r>
+              <w:rPr>
+                <w:rFonts w:ascii="Arial" w:hAnsi="Arial"/>
+                <w:bCs/>
+                <w:color w:val="000000" w:themeColor="text1"/>
+                <w:sz w:val="16"/>
+                <w:szCs w:val="16"/>
+              </w:rPr>
+              <w:t xml:space="preserve"> KG  </w:t>
+            </w:r>
           </w:p>
         </w:tc>
         <w:tc>
@@ -3419,6 +3382,16 @@
                 <w:lang w:val="es-PE"/>
               </w:rPr>
             </w:pPr>
+            <w:r>
+              <w:rPr>
+                <w:rFonts w:ascii="Arial" w:hAnsi="Arial"/>
+                <w:bCs/>
+                <w:color w:val="000000" w:themeColor="text1"/>
+                <w:sz w:val="16"/>
+                <w:szCs w:val="16"/>
+              </w:rPr>
+              <w:t xml:space="preserve">  </w:t>
+            </w:r>
             <w:r>
               <w:rPr>
                 <w:rFonts w:ascii="Arial" w:hAnsi="Arial"/>
@@ -3663,6 +3636,16 @@
               </w:rPr>
               <w:fldChar w:fldCharType="end"/>
             </w:r>
+            <w:r>
+              <w:rPr>
+                <w:rFonts w:ascii="Arial" w:hAnsi="Arial"/>
+                <w:bCs/>
+                <w:color w:val="000000" w:themeColor="text1"/>
+                <w:sz w:val="16"/>
+                <w:szCs w:val="16"/>
+              </w:rPr>
+              <w:t xml:space="preserve"> KG</w:t>
+            </w:r>
           </w:p>
         </w:tc>
         <w:tc>
@@ -3679,6 +3662,16 @@
                 <w:szCs w:val="16"/>
               </w:rPr>
             </w:pPr>
+            <w:r>
+              <w:rPr>
+                <w:rFonts w:ascii="Arial" w:hAnsi="Arial"/>
+                <w:bCs/>
+                <w:color w:val="000000" w:themeColor="text1"/>
+                <w:sz w:val="16"/>
+                <w:szCs w:val="16"/>
+              </w:rPr>
+              <w:t xml:space="preserve">  </w:t>
+            </w:r>
             <w:r>
               <w:rPr>
                 <w:rFonts w:ascii="Arial" w:hAnsi="Arial"/>
@@ -3860,6 +3853,16 @@
                 <w:szCs w:val="16"/>
               </w:rPr>
               <w:fldChar w:fldCharType="end"/>
+            </w:r>
+            <w:r>
+              <w:rPr>
+                <w:rFonts w:ascii="Arial" w:hAnsi="Arial"/>
+                <w:bCs/>
+                <w:color w:val="000000" w:themeColor="text1"/>
+                <w:sz w:val="16"/>
+                <w:szCs w:val="16"/>
+              </w:rPr>
+              <w:t xml:space="preserve"> KG</w:t>
             </w:r>
           </w:p>
         </w:tc>

</xml_diff>

<commit_message>
agregar formato excel a chancado y muestreo develop
</commit_message>
<xml_diff>
--- a/pesaje/analytica/Report/PrintTicket.docx
+++ b/pesaje/analytica/Report/PrintTicket.docx
@@ -5,29 +5,45 @@
     <w:tbl>
       <w:tblPr>
         <w:tblpPr w:leftFromText="141" w:rightFromText="141" w:vertAnchor="page" w:horzAnchor="margin" w:tblpY="427"/>
-        <w:tblW w:w="11057" w:type="dxa"/>
-        <w:tblBorders>
-          <w:insideH w:val="single" w:sz="4" w:space="0" w:color="auto"/>
-        </w:tblBorders>
+        <w:tblW w:w="11548" w:type="dxa"/>
         <w:tblLook w:val="04A0" w:firstRow="1" w:lastRow="0" w:firstColumn="1" w:lastColumn="0" w:noHBand="0" w:noVBand="1"/>
       </w:tblPr>
       <w:tblGrid>
-        <w:gridCol w:w="3261"/>
-        <w:gridCol w:w="5386"/>
-        <w:gridCol w:w="2410"/>
+        <w:gridCol w:w="3406"/>
+        <w:gridCol w:w="5627"/>
+        <w:gridCol w:w="2515"/>
       </w:tblGrid>
       <w:tr>
         <w:trPr>
-          <w:trHeight w:val="1692"/>
+          <w:trHeight w:val="1261"/>
         </w:trPr>
         <w:tc>
           <w:tcPr>
-            <w:tcW w:w="3261" w:type="dxa"/>
+            <w:tcW w:w="3406" w:type="dxa"/>
           </w:tcPr>
           <w:p>
             <w:pPr>
               <w:pStyle w:val="Encabezado"/>
               <w:ind w:left="142"/>
+              <w:jc w:val="center"/>
+            </w:pPr>
+          </w:p>
+        </w:tc>
+        <w:tc>
+          <w:tcPr>
+            <w:tcW w:w="5627" w:type="dxa"/>
+          </w:tcPr>
+          <w:p>
+            <w:pPr>
+              <w:jc w:val="center"/>
+              <w:rPr>
+                <w:rFonts w:ascii="Arial" w:hAnsi="Arial"/>
+                <w:b/>
+                <w:bCs/>
+                <w:sz w:val="28"/>
+                <w:szCs w:val="28"/>
+                <w:lang w:val="it-IT"/>
+              </w:rPr>
             </w:pPr>
             <w:r>
               <w:rPr>
@@ -40,15 +56,15 @@
               <mc:AlternateContent>
                 <mc:Choice Requires="wps">
                   <w:drawing>
-                    <wp:anchor distT="0" distB="0" distL="114300" distR="114300" simplePos="0" relativeHeight="251661312" behindDoc="0" locked="0" layoutInCell="1" allowOverlap="1" wp14:anchorId="557EE397" wp14:editId="439FFB2A">
+                    <wp:anchor distT="0" distB="0" distL="114300" distR="114300" simplePos="0" relativeHeight="251661312" behindDoc="0" locked="0" layoutInCell="1" allowOverlap="1" wp14:anchorId="557EE397" wp14:editId="20E4906A">
                       <wp:simplePos x="0" y="0"/>
                       <wp:positionH relativeFrom="margin">
-                        <wp:posOffset>-51647</wp:posOffset>
+                        <wp:posOffset>-2245245</wp:posOffset>
                       </wp:positionH>
                       <wp:positionV relativeFrom="page">
-                        <wp:posOffset>25823</wp:posOffset>
+                        <wp:posOffset>-190442</wp:posOffset>
                       </wp:positionV>
-                      <wp:extent cx="2218267" cy="1127760"/>
+                      <wp:extent cx="2258060" cy="934720"/>
                       <wp:effectExtent l="0" t="0" r="0" b="0"/>
                       <wp:wrapNone/>
                       <wp:docPr id="1154350600" name="Rectángulo: esquinas redondeadas 1154350600"/>
@@ -64,7 +80,7 @@
                             <wps:spPr bwMode="auto">
                               <a:xfrm>
                                 <a:off x="0" y="0"/>
-                                <a:ext cx="2218267" cy="1127760"/>
+                                <a:ext cx="2258060" cy="934720"/>
                               </a:xfrm>
                               <a:prstGeom prst="roundRect">
                                 <a:avLst>
@@ -146,7 +162,7 @@
                 </mc:Choice>
                 <mc:Fallback>
                   <w:pict>
-                    <v:roundrect w14:anchorId="557EE397" id="Rectángulo: esquinas redondeadas 1154350600" o:spid="_x0000_s1026" style="position:absolute;left:0;text-align:left;margin-left:-4.05pt;margin-top:2.05pt;width:174.65pt;height:88.8pt;z-index:251661312;visibility:visible;mso-wrap-style:square;mso-width-percent:0;mso-height-percent:0;mso-wrap-distance-left:9pt;mso-wrap-distance-top:0;mso-wrap-distance-right:9pt;mso-wrap-distance-bottom:0;mso-position-horizontal:absolute;mso-position-horizontal-relative:margin;mso-position-vertical:absolute;mso-position-vertical-relative:page;mso-width-percent:0;mso-height-percent:0;mso-width-relative:margin;mso-height-relative:margin;v-text-anchor:top" arcsize="10923f" o:gfxdata="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" filled="f" stroked="f">
+                    <v:roundrect w14:anchorId="557EE397" id="Rectángulo: esquinas redondeadas 1154350600" o:spid="_x0000_s1026" style="position:absolute;left:0;text-align:left;margin-left:-176.8pt;margin-top:-15pt;width:177.8pt;height:73.6pt;z-index:251661312;visibility:visible;mso-wrap-style:square;mso-width-percent:0;mso-height-percent:0;mso-wrap-distance-left:9pt;mso-wrap-distance-top:0;mso-wrap-distance-right:9pt;mso-wrap-distance-bottom:0;mso-position-horizontal:absolute;mso-position-horizontal-relative:margin;mso-position-vertical:absolute;mso-position-vertical-relative:page;mso-width-percent:0;mso-height-percent:0;mso-width-relative:margin;mso-height-relative:margin;v-text-anchor:top" arcsize="10923f" o:gfxdata="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" filled="f" stroked="f">
                       <v:stroke joinstyle="miter"/>
                       <v:textbox>
                         <w:txbxContent>
@@ -205,26 +221,61 @@
               </mc:AlternateContent>
             </w:r>
             <w:r>
-              <w:t xml:space="preserve">                       </w:t>
-            </w:r>
-          </w:p>
-          <w:p>
-            <w:pPr>
-              <w:pStyle w:val="Encabezado"/>
-              <w:ind w:left="142"/>
-            </w:pPr>
-          </w:p>
-          <w:p>
-            <w:pPr>
-              <w:pStyle w:val="Encabezado"/>
-              <w:ind w:left="142"/>
-            </w:pPr>
-          </w:p>
-          <w:p>
-            <w:pPr>
-              <w:pStyle w:val="Encabezado"/>
-              <w:ind w:left="142"/>
-            </w:pPr>
+              <w:rPr>
+                <w:rFonts w:ascii="Arial" w:hAnsi="Arial"/>
+                <w:b/>
+                <w:bCs/>
+                <w:sz w:val="28"/>
+                <w:szCs w:val="28"/>
+                <w:lang w:val="it-IT"/>
+              </w:rPr>
+              <w:fldChar w:fldCharType="begin"/>
+            </w:r>
+            <w:r>
+              <w:rPr>
+                <w:rFonts w:ascii="Arial" w:hAnsi="Arial"/>
+                <w:b/>
+                <w:bCs/>
+                <w:sz w:val="28"/>
+                <w:szCs w:val="28"/>
+                <w:lang w:val="it-IT"/>
+              </w:rPr>
+              <w:instrText xml:space="preserve"> MERGEFIELD  razon_social_empresa  \* MERGEFORMAT </w:instrText>
+            </w:r>
+            <w:r>
+              <w:rPr>
+                <w:rFonts w:ascii="Arial" w:hAnsi="Arial"/>
+                <w:b/>
+                <w:bCs/>
+                <w:sz w:val="28"/>
+                <w:szCs w:val="28"/>
+                <w:lang w:val="it-IT"/>
+              </w:rPr>
+              <w:fldChar w:fldCharType="separate"/>
+            </w:r>
+            <w:r>
+              <w:rPr>
+                <w:rFonts w:ascii="Arial" w:hAnsi="Arial"/>
+                <w:b/>
+                <w:bCs/>
+                <w:noProof/>
+                <w:sz w:val="28"/>
+                <w:szCs w:val="28"/>
+                <w:lang w:val="it-IT"/>
+              </w:rPr>
+              <w:t>«razon_social_empresa»</w:t>
+            </w:r>
+            <w:r>
+              <w:rPr>
+                <w:rFonts w:ascii="Arial" w:hAnsi="Arial"/>
+                <w:b/>
+                <w:bCs/>
+                <w:sz w:val="28"/>
+                <w:szCs w:val="28"/>
+                <w:lang w:val="it-IT"/>
+              </w:rPr>
+              <w:fldChar w:fldCharType="end"/>
+            </w:r>
           </w:p>
           <w:p>
             <w:pPr>
@@ -235,28 +286,77 @@
                 <w:rFonts w:ascii="Arial" w:hAnsi="Arial"/>
                 <w:b/>
                 <w:bCs/>
-                <w:sz w:val="14"/>
-                <w:szCs w:val="14"/>
+                <w:sz w:val="24"/>
+                <w:szCs w:val="24"/>
                 <w:lang w:val="it-IT"/>
               </w:rPr>
             </w:pPr>
-          </w:p>
-          <w:p>
-            <w:pPr>
-              <w:pStyle w:val="Encabezado"/>
+            <w:r>
               <w:rPr>
                 <w:rFonts w:ascii="Arial" w:hAnsi="Arial"/>
                 <w:b/>
                 <w:bCs/>
                 <w:lang w:val="it-IT"/>
               </w:rPr>
-            </w:pPr>
-          </w:p>
-        </w:tc>
-        <w:tc>
-          <w:tcPr>
-            <w:tcW w:w="5386" w:type="dxa"/>
-          </w:tcPr>
+              <w:fldChar w:fldCharType="begin"/>
+            </w:r>
+            <w:r>
+              <w:rPr>
+                <w:rFonts w:ascii="Arial" w:hAnsi="Arial"/>
+                <w:b/>
+                <w:bCs/>
+                <w:lang w:val="it-IT"/>
+              </w:rPr>
+              <w:instrText xml:space="preserve"> MERGEFIELD  </w:instrText>
+            </w:r>
+            <w:r>
+              <w:rPr>
+                <w:rFonts w:ascii="Arial" w:hAnsi="Arial"/>
+                <w:b/>
+                <w:bCs/>
+                <w:noProof/>
+                <w:lang w:val="it-IT"/>
+              </w:rPr>
+              <w:instrText>direc_empresa</w:instrText>
+            </w:r>
+            <w:r>
+              <w:rPr>
+                <w:rFonts w:ascii="Arial" w:hAnsi="Arial"/>
+                <w:b/>
+                <w:bCs/>
+                <w:lang w:val="it-IT"/>
+              </w:rPr>
+              <w:instrText xml:space="preserve">  \* MERGEFORMAT </w:instrText>
+            </w:r>
+            <w:r>
+              <w:rPr>
+                <w:rFonts w:ascii="Arial" w:hAnsi="Arial"/>
+                <w:b/>
+                <w:bCs/>
+                <w:lang w:val="it-IT"/>
+              </w:rPr>
+              <w:fldChar w:fldCharType="separate"/>
+            </w:r>
+            <w:r>
+              <w:rPr>
+                <w:rFonts w:ascii="Arial" w:hAnsi="Arial"/>
+                <w:b/>
+                <w:bCs/>
+                <w:noProof/>
+                <w:lang w:val="it-IT"/>
+              </w:rPr>
+              <w:t>«direc_empresa»</w:t>
+            </w:r>
+            <w:r>
+              <w:rPr>
+                <w:rFonts w:ascii="Arial" w:hAnsi="Arial"/>
+                <w:b/>
+                <w:bCs/>
+                <w:lang w:val="it-IT"/>
+              </w:rPr>
+              <w:fldChar w:fldCharType="end"/>
+            </w:r>
+          </w:p>
           <w:p>
             <w:pPr>
               <w:jc w:val="center"/>
@@ -269,183 +369,21 @@
                 <w:lang w:val="it-IT"/>
               </w:rPr>
             </w:pPr>
-            <w:r>
-              <w:rPr>
-                <w:rFonts w:ascii="Arial" w:hAnsi="Arial"/>
-                <w:b/>
-                <w:bCs/>
-                <w:sz w:val="28"/>
-                <w:szCs w:val="28"/>
-                <w:lang w:val="it-IT"/>
-              </w:rPr>
-              <w:fldChar w:fldCharType="begin"/>
-            </w:r>
-            <w:r>
-              <w:rPr>
-                <w:rFonts w:ascii="Arial" w:hAnsi="Arial"/>
-                <w:b/>
-                <w:bCs/>
-                <w:sz w:val="28"/>
-                <w:szCs w:val="28"/>
-                <w:lang w:val="it-IT"/>
-              </w:rPr>
-              <w:instrText xml:space="preserve"> MERGEFIELD  razon_social_empresa  \* MERGEFORMAT </w:instrText>
-            </w:r>
-            <w:r>
-              <w:rPr>
-                <w:rFonts w:ascii="Arial" w:hAnsi="Arial"/>
-                <w:b/>
-                <w:bCs/>
-                <w:sz w:val="28"/>
-                <w:szCs w:val="28"/>
-                <w:lang w:val="it-IT"/>
-              </w:rPr>
-              <w:fldChar w:fldCharType="separate"/>
-            </w:r>
-            <w:r>
-              <w:rPr>
-                <w:rFonts w:ascii="Arial" w:hAnsi="Arial"/>
-                <w:b/>
-                <w:bCs/>
-                <w:noProof/>
-                <w:sz w:val="28"/>
-                <w:szCs w:val="28"/>
-                <w:lang w:val="it-IT"/>
-              </w:rPr>
-              <w:t>«razon_social_empresa»</w:t>
-            </w:r>
-            <w:r>
-              <w:rPr>
-                <w:rFonts w:ascii="Arial" w:hAnsi="Arial"/>
-                <w:b/>
-                <w:bCs/>
-                <w:sz w:val="28"/>
-                <w:szCs w:val="28"/>
-                <w:lang w:val="it-IT"/>
-              </w:rPr>
-              <w:fldChar w:fldCharType="end"/>
-            </w:r>
-          </w:p>
+          </w:p>
+        </w:tc>
+        <w:tc>
+          <w:tcPr>
+            <w:tcW w:w="2515" w:type="dxa"/>
+          </w:tcPr>
           <w:p>
             <w:pPr>
               <w:pStyle w:val="Encabezado"/>
-              <w:ind w:left="142"/>
               <w:jc w:val="center"/>
               <w:rPr>
                 <w:rFonts w:ascii="Arial" w:hAnsi="Arial"/>
                 <w:b/>
                 <w:bCs/>
-                <w:sz w:val="24"/>
-                <w:szCs w:val="24"/>
-                <w:lang w:val="it-IT"/>
-              </w:rPr>
-            </w:pPr>
-            <w:r>
-              <w:rPr>
-                <w:rFonts w:ascii="Arial" w:hAnsi="Arial"/>
-                <w:b/>
-                <w:bCs/>
-                <w:lang w:val="it-IT"/>
-              </w:rPr>
-              <w:fldChar w:fldCharType="begin"/>
-            </w:r>
-            <w:r>
-              <w:rPr>
-                <w:rFonts w:ascii="Arial" w:hAnsi="Arial"/>
-                <w:b/>
-                <w:bCs/>
-                <w:lang w:val="it-IT"/>
-              </w:rPr>
-              <w:instrText xml:space="preserve"> MERGEFIELD  </w:instrText>
-            </w:r>
-            <w:r>
-              <w:rPr>
-                <w:rFonts w:ascii="Arial" w:hAnsi="Arial"/>
-                <w:b/>
-                <w:bCs/>
-                <w:noProof/>
-                <w:lang w:val="it-IT"/>
-              </w:rPr>
-              <w:instrText>direc_empresa</w:instrText>
-            </w:r>
-            <w:r>
-              <w:rPr>
-                <w:rFonts w:ascii="Arial" w:hAnsi="Arial"/>
-                <w:b/>
-                <w:bCs/>
-                <w:lang w:val="it-IT"/>
-              </w:rPr>
-              <w:instrText xml:space="preserve">  \* MERGEFORMAT </w:instrText>
-            </w:r>
-            <w:r>
-              <w:rPr>
-                <w:rFonts w:ascii="Arial" w:hAnsi="Arial"/>
-                <w:b/>
-                <w:bCs/>
-                <w:lang w:val="it-IT"/>
-              </w:rPr>
-              <w:fldChar w:fldCharType="separate"/>
-            </w:r>
-            <w:r>
-              <w:rPr>
-                <w:rFonts w:ascii="Arial" w:hAnsi="Arial"/>
-                <w:b/>
-                <w:bCs/>
-                <w:noProof/>
-                <w:lang w:val="it-IT"/>
-              </w:rPr>
-              <w:t>«direc_empresa»</w:t>
-            </w:r>
-            <w:r>
-              <w:rPr>
-                <w:rFonts w:ascii="Arial" w:hAnsi="Arial"/>
-                <w:b/>
-                <w:bCs/>
-                <w:lang w:val="it-IT"/>
-              </w:rPr>
-              <w:fldChar w:fldCharType="end"/>
-            </w:r>
-          </w:p>
-          <w:p>
-            <w:pPr>
-              <w:jc w:val="center"/>
-              <w:rPr>
-                <w:rFonts w:ascii="Arial" w:hAnsi="Arial"/>
-                <w:b/>
-                <w:bCs/>
-                <w:sz w:val="32"/>
-                <w:szCs w:val="32"/>
-                <w:lang w:val="it-IT"/>
-              </w:rPr>
-            </w:pPr>
-          </w:p>
-        </w:tc>
-        <w:tc>
-          <w:tcPr>
-            <w:tcW w:w="2410" w:type="dxa"/>
-          </w:tcPr>
-          <w:p>
-            <w:pPr>
-              <w:pStyle w:val="Encabezado"/>
-              <w:rPr>
-                <w:rFonts w:ascii="Arial" w:hAnsi="Arial"/>
-                <w:b/>
-                <w:bCs/>
-                <w:noProof/>
-                <w:lang w:val="es-PE" w:eastAsia="es-PE"/>
-              </w:rPr>
-            </w:pPr>
-          </w:p>
-          <w:p>
-            <w:pPr>
-              <w:pStyle w:val="Encabezado"/>
-              <w:ind w:left="142"/>
-              <w:jc w:val="center"/>
-              <w:rPr>
-                <w:b/>
-                <w:noProof/>
-                <w:sz w:val="36"/>
-                <w:szCs w:val="36"/>
+                <w:noProof/>
                 <w:lang w:val="es-PE" w:eastAsia="es-PE"/>
               </w:rPr>
             </w:pPr>
@@ -505,12 +443,89 @@
     </w:tbl>
     <w:p>
       <w:pPr>
-        <w:spacing w:line="200" w:lineRule="exact"/>
         <w:rPr>
-          <w:rFonts w:ascii="Times New Roman" w:eastAsia="Times New Roman" w:hAnsi="Times New Roman"/>
-          <w:sz w:val="16"/>
-          <w:szCs w:val="16"/>
-          <w:lang w:val="es-PE"/>
+          <w:rFonts w:ascii="Arial" w:eastAsia="Times New Roman" w:hAnsi="Arial"/>
+          <w:vanish/>
+          <w:sz w:val="10"/>
+          <w:szCs w:val="10"/>
+          <w:lang w:eastAsia="es-PE"/>
+        </w:rPr>
+      </w:pPr>
+    </w:p>
+    <w:p>
+      <w:pPr>
+        <w:rPr>
+          <w:rFonts w:ascii="Arial" w:eastAsia="Times New Roman" w:hAnsi="Arial"/>
+          <w:vanish/>
+          <w:sz w:val="10"/>
+          <w:szCs w:val="10"/>
+          <w:lang w:eastAsia="es-PE"/>
+        </w:rPr>
+      </w:pPr>
+    </w:p>
+    <w:p>
+      <w:pPr>
+        <w:rPr>
+          <w:rFonts w:ascii="Arial" w:eastAsia="Times New Roman" w:hAnsi="Arial"/>
+          <w:vanish/>
+          <w:sz w:val="10"/>
+          <w:szCs w:val="10"/>
+          <w:lang w:eastAsia="es-PE"/>
+        </w:rPr>
+      </w:pPr>
+    </w:p>
+    <w:p>
+      <w:pPr>
+        <w:rPr>
+          <w:rFonts w:ascii="Arial" w:eastAsia="Times New Roman" w:hAnsi="Arial"/>
+          <w:vanish/>
+          <w:sz w:val="10"/>
+          <w:szCs w:val="10"/>
+          <w:lang w:eastAsia="es-PE"/>
+        </w:rPr>
+      </w:pPr>
+    </w:p>
+    <w:p>
+      <w:pPr>
+        <w:rPr>
+          <w:rFonts w:ascii="Arial" w:eastAsia="Times New Roman" w:hAnsi="Arial"/>
+          <w:vanish/>
+          <w:sz w:val="10"/>
+          <w:szCs w:val="10"/>
+          <w:lang w:eastAsia="es-PE"/>
+        </w:rPr>
+      </w:pPr>
+    </w:p>
+    <w:p>
+      <w:pPr>
+        <w:rPr>
+          <w:rFonts w:ascii="Arial" w:eastAsia="Times New Roman" w:hAnsi="Arial"/>
+          <w:vanish/>
+          <w:sz w:val="10"/>
+          <w:szCs w:val="10"/>
+          <w:lang w:eastAsia="es-PE"/>
+        </w:rPr>
+      </w:pPr>
+    </w:p>
+    <w:p>
+      <w:pPr>
+        <w:rPr>
+          <w:rFonts w:ascii="Arial" w:eastAsia="Times New Roman" w:hAnsi="Arial"/>
+          <w:vanish/>
+          <w:sz w:val="10"/>
+          <w:szCs w:val="10"/>
+          <w:lang w:eastAsia="es-PE"/>
+        </w:rPr>
+      </w:pPr>
+    </w:p>
+    <w:p>
+      <w:pPr>
+        <w:rPr>
+          <w:rFonts w:ascii="Arial" w:eastAsia="Times New Roman" w:hAnsi="Arial"/>
+          <w:vanish/>
+          <w:sz w:val="10"/>
+          <w:szCs w:val="10"/>
+          <w:lang w:eastAsia="es-PE"/>
         </w:rPr>
       </w:pPr>
     </w:p>
@@ -521,901 +536,11 @@
           <w:szCs w:val="10"/>
         </w:rPr>
       </w:pPr>
-      <w:r>
-        <w:rPr>
-          <w:rFonts w:ascii="Arial" w:eastAsia="Times New Roman" w:hAnsi="Arial"/>
-          <w:vanish/>
-          <w:sz w:val="10"/>
-          <w:szCs w:val="10"/>
-          <w:lang w:eastAsia="es-PE"/>
-        </w:rPr>
-        <w:t>Final del formulario</w:t>
-      </w:r>
     </w:p>
     <w:tbl>
       <w:tblPr>
         <w:tblStyle w:val="Tablaconcuadrculaclara"/>
-        <w:tblW w:w="5000" w:type="pct"/>
-        <w:tblInd w:w="-5" w:type="dxa"/>
-        <w:tblBorders>
-          <w:top w:val="none" w:sz="0" w:space="0" w:color="auto"/>
-          <w:left w:val="none" w:sz="0" w:space="0" w:color="auto"/>
-          <w:bottom w:val="single" w:sz="4" w:space="0" w:color="D9D9D9" w:themeColor="background1" w:themeShade="D9"/>
-          <w:right w:val="none" w:sz="0" w:space="0" w:color="auto"/>
-          <w:insideH w:val="none" w:sz="0" w:space="0" w:color="auto"/>
-          <w:insideV w:val="none" w:sz="0" w:space="0" w:color="auto"/>
-        </w:tblBorders>
-        <w:tblLayout w:type="fixed"/>
-        <w:tblCellMar>
-          <w:left w:w="0" w:type="dxa"/>
-          <w:right w:w="0" w:type="dxa"/>
-        </w:tblCellMar>
-        <w:tblLook w:val="04A0" w:firstRow="1" w:lastRow="0" w:firstColumn="1" w:lastColumn="0" w:noHBand="0" w:noVBand="1"/>
-        <w:tblDescription w:val="Tabla de diseño de encabezado"/>
-      </w:tblPr>
-      <w:tblGrid>
-        <w:gridCol w:w="1706"/>
-        <w:gridCol w:w="3642"/>
-        <w:gridCol w:w="2674"/>
-        <w:gridCol w:w="2674"/>
-      </w:tblGrid>
-      <w:tr>
-        <w:trPr>
-          <w:trHeight w:val="378"/>
-        </w:trPr>
-        <w:tc>
-          <w:tcPr>
-            <w:tcW w:w="1706" w:type="dxa"/>
-          </w:tcPr>
-          <w:p>
-            <w:pPr>
-              <w:rPr>
-                <w:rFonts w:ascii="Arial" w:hAnsi="Arial"/>
-                <w:bCs/>
-                <w:color w:val="000000" w:themeColor="text1"/>
-                <w:sz w:val="16"/>
-                <w:szCs w:val="16"/>
-              </w:rPr>
-            </w:pPr>
-            <w:r>
-              <w:rPr>
-                <w:rFonts w:ascii="Arial" w:hAnsi="Arial"/>
-                <w:b/>
-                <w:color w:val="000000" w:themeColor="text1"/>
-                <w:sz w:val="16"/>
-                <w:szCs w:val="16"/>
-                <w:lang w:val="es-PE"/>
-              </w:rPr>
-              <w:t>Sede Productiva</w:t>
-            </w:r>
-          </w:p>
-        </w:tc>
-        <w:tc>
-          <w:tcPr>
-            <w:tcW w:w="3642" w:type="dxa"/>
-          </w:tcPr>
-          <w:p>
-            <w:pPr>
-              <w:rPr>
-                <w:rFonts w:ascii="Arial" w:hAnsi="Arial"/>
-                <w:bCs/>
-                <w:color w:val="000000" w:themeColor="text1"/>
-                <w:sz w:val="16"/>
-                <w:szCs w:val="16"/>
-              </w:rPr>
-            </w:pPr>
-            <w:r>
-              <w:rPr>
-                <w:rFonts w:ascii="Arial" w:hAnsi="Arial"/>
-                <w:bCs/>
-                <w:color w:val="000000" w:themeColor="text1"/>
-                <w:sz w:val="16"/>
-                <w:szCs w:val="16"/>
-              </w:rPr>
-              <w:fldChar w:fldCharType="begin"/>
-            </w:r>
-            <w:r>
-              <w:rPr>
-                <w:rFonts w:ascii="Arial" w:hAnsi="Arial"/>
-                <w:bCs/>
-                <w:color w:val="000000" w:themeColor="text1"/>
-                <w:sz w:val="16"/>
-                <w:szCs w:val="16"/>
-              </w:rPr>
-              <w:instrText xml:space="preserve"> MERGEFIELD  </w:instrText>
-            </w:r>
-            <w:r>
-              <w:rPr>
-                <w:rFonts w:ascii="Arial" w:hAnsi="Arial"/>
-                <w:bCs/>
-                <w:noProof/>
-                <w:color w:val="000000" w:themeColor="text1"/>
-                <w:sz w:val="16"/>
-                <w:szCs w:val="16"/>
-              </w:rPr>
-              <w:instrText>sucursal_empresa</w:instrText>
-            </w:r>
-            <w:r>
-              <w:rPr>
-                <w:rFonts w:ascii="Arial" w:hAnsi="Arial"/>
-                <w:bCs/>
-                <w:color w:val="000000" w:themeColor="text1"/>
-                <w:sz w:val="16"/>
-                <w:szCs w:val="16"/>
-              </w:rPr>
-              <w:instrText xml:space="preserve">  \* MERGEFORMAT </w:instrText>
-            </w:r>
-            <w:r>
-              <w:rPr>
-                <w:rFonts w:ascii="Arial" w:hAnsi="Arial"/>
-                <w:bCs/>
-                <w:color w:val="000000" w:themeColor="text1"/>
-                <w:sz w:val="16"/>
-                <w:szCs w:val="16"/>
-              </w:rPr>
-              <w:fldChar w:fldCharType="separate"/>
-            </w:r>
-            <w:r>
-              <w:rPr>
-                <w:rFonts w:ascii="Arial" w:hAnsi="Arial"/>
-                <w:bCs/>
-                <w:noProof/>
-                <w:color w:val="000000" w:themeColor="text1"/>
-                <w:sz w:val="16"/>
-                <w:szCs w:val="16"/>
-              </w:rPr>
-              <w:t>«sucursal_empresa»</w:t>
-            </w:r>
-            <w:r>
-              <w:rPr>
-                <w:rFonts w:ascii="Arial" w:hAnsi="Arial"/>
-                <w:bCs/>
-                <w:color w:val="000000" w:themeColor="text1"/>
-                <w:sz w:val="16"/>
-                <w:szCs w:val="16"/>
-              </w:rPr>
-              <w:fldChar w:fldCharType="end"/>
-            </w:r>
-          </w:p>
-        </w:tc>
-        <w:tc>
-          <w:tcPr>
-            <w:tcW w:w="2674" w:type="dxa"/>
-          </w:tcPr>
-          <w:p>
-            <w:pPr>
-              <w:rPr>
-                <w:rFonts w:ascii="Arial" w:hAnsi="Arial"/>
-                <w:bCs/>
-                <w:color w:val="000000" w:themeColor="text1"/>
-                <w:sz w:val="16"/>
-                <w:szCs w:val="16"/>
-              </w:rPr>
-            </w:pPr>
-            <w:proofErr w:type="gramStart"/>
-            <w:r>
-              <w:rPr>
-                <w:rFonts w:ascii="Arial" w:hAnsi="Arial"/>
-                <w:b/>
-                <w:color w:val="000000" w:themeColor="text1"/>
-                <w:sz w:val="16"/>
-                <w:szCs w:val="16"/>
-                <w:lang w:val="es-PE"/>
-              </w:rPr>
-              <w:t>Ticket</w:t>
-            </w:r>
-            <w:proofErr w:type="gramEnd"/>
-            <w:r>
-              <w:rPr>
-                <w:rFonts w:ascii="Arial" w:hAnsi="Arial"/>
-                <w:b/>
-                <w:color w:val="000000" w:themeColor="text1"/>
-                <w:sz w:val="16"/>
-                <w:szCs w:val="16"/>
-                <w:lang w:val="es-PE"/>
-              </w:rPr>
-              <w:t xml:space="preserve"> de Pesaje </w:t>
-            </w:r>
-            <w:proofErr w:type="spellStart"/>
-            <w:r>
-              <w:rPr>
-                <w:rFonts w:ascii="Arial" w:hAnsi="Arial"/>
-                <w:b/>
-                <w:color w:val="000000" w:themeColor="text1"/>
-                <w:sz w:val="16"/>
-                <w:szCs w:val="16"/>
-                <w:lang w:val="es-PE"/>
-              </w:rPr>
-              <w:t>N°</w:t>
-            </w:r>
-            <w:proofErr w:type="spellEnd"/>
-          </w:p>
-        </w:tc>
-        <w:tc>
-          <w:tcPr>
-            <w:tcW w:w="2674" w:type="dxa"/>
-          </w:tcPr>
-          <w:p>
-            <w:pPr>
-              <w:rPr>
-                <w:rFonts w:ascii="Arial" w:hAnsi="Arial"/>
-                <w:bCs/>
-                <w:color w:val="000000" w:themeColor="text1"/>
-                <w:sz w:val="16"/>
-                <w:szCs w:val="16"/>
-              </w:rPr>
-            </w:pPr>
-            <w:r>
-              <w:rPr>
-                <w:rFonts w:ascii="Arial" w:hAnsi="Arial"/>
-                <w:bCs/>
-                <w:noProof/>
-                <w:color w:val="000000" w:themeColor="text1"/>
-                <w:sz w:val="16"/>
-                <w:szCs w:val="16"/>
-              </w:rPr>
-              <w:fldChar w:fldCharType="begin"/>
-            </w:r>
-            <w:r>
-              <w:rPr>
-                <w:rFonts w:ascii="Arial" w:hAnsi="Arial"/>
-                <w:bCs/>
-                <w:noProof/>
-                <w:color w:val="000000" w:themeColor="text1"/>
-                <w:sz w:val="16"/>
-                <w:szCs w:val="16"/>
-              </w:rPr>
-              <w:instrText xml:space="preserve"> MERGEFIELD  nro_ticket  \* MERGEFORMAT </w:instrText>
-            </w:r>
-            <w:r>
-              <w:rPr>
-                <w:rFonts w:ascii="Arial" w:hAnsi="Arial"/>
-                <w:bCs/>
-                <w:noProof/>
-                <w:color w:val="000000" w:themeColor="text1"/>
-                <w:sz w:val="16"/>
-                <w:szCs w:val="16"/>
-              </w:rPr>
-              <w:fldChar w:fldCharType="separate"/>
-            </w:r>
-            <w:r>
-              <w:rPr>
-                <w:rFonts w:ascii="Arial" w:hAnsi="Arial"/>
-                <w:bCs/>
-                <w:noProof/>
-                <w:color w:val="000000" w:themeColor="text1"/>
-                <w:sz w:val="16"/>
-                <w:szCs w:val="16"/>
-              </w:rPr>
-              <w:t>«nro_ticket»</w:t>
-            </w:r>
-            <w:r>
-              <w:rPr>
-                <w:rFonts w:ascii="Arial" w:hAnsi="Arial"/>
-                <w:bCs/>
-                <w:noProof/>
-                <w:color w:val="000000" w:themeColor="text1"/>
-                <w:sz w:val="16"/>
-                <w:szCs w:val="16"/>
-              </w:rPr>
-              <w:fldChar w:fldCharType="end"/>
-            </w:r>
-          </w:p>
-        </w:tc>
-      </w:tr>
-      <w:tr>
-        <w:trPr>
-          <w:trHeight w:val="378"/>
-        </w:trPr>
-        <w:tc>
-          <w:tcPr>
-            <w:tcW w:w="1706" w:type="dxa"/>
-          </w:tcPr>
-          <w:p>
-            <w:pPr>
-              <w:rPr>
-                <w:rFonts w:ascii="Arial" w:hAnsi="Arial"/>
-                <w:bCs/>
-                <w:color w:val="000000" w:themeColor="text1"/>
-                <w:sz w:val="16"/>
-                <w:szCs w:val="16"/>
-              </w:rPr>
-            </w:pPr>
-            <w:r>
-              <w:rPr>
-                <w:rFonts w:ascii="Arial" w:hAnsi="Arial"/>
-                <w:b/>
-                <w:color w:val="000000" w:themeColor="text1"/>
-                <w:sz w:val="16"/>
-                <w:szCs w:val="16"/>
-                <w:lang w:val="es-PE"/>
-              </w:rPr>
-              <w:t xml:space="preserve">Dirección </w:t>
-            </w:r>
-          </w:p>
-        </w:tc>
-        <w:tc>
-          <w:tcPr>
-            <w:tcW w:w="3642" w:type="dxa"/>
-          </w:tcPr>
-          <w:p>
-            <w:pPr>
-              <w:rPr>
-                <w:rFonts w:ascii="Arial" w:hAnsi="Arial"/>
-                <w:bCs/>
-                <w:color w:val="000000" w:themeColor="text1"/>
-                <w:sz w:val="16"/>
-                <w:szCs w:val="16"/>
-              </w:rPr>
-            </w:pPr>
-            <w:r>
-              <w:rPr>
-                <w:rFonts w:ascii="Arial" w:hAnsi="Arial"/>
-                <w:bCs/>
-                <w:noProof/>
-                <w:color w:val="000000" w:themeColor="text1"/>
-                <w:sz w:val="16"/>
-                <w:szCs w:val="16"/>
-              </w:rPr>
-              <w:fldChar w:fldCharType="begin"/>
-            </w:r>
-            <w:r>
-              <w:rPr>
-                <w:rFonts w:ascii="Arial" w:hAnsi="Arial"/>
-                <w:bCs/>
-                <w:noProof/>
-                <w:color w:val="000000" w:themeColor="text1"/>
-                <w:sz w:val="16"/>
-                <w:szCs w:val="16"/>
-              </w:rPr>
-              <w:instrText xml:space="preserve"> MERGEFIELD  direc_empresa  \* MERGEFORMAT </w:instrText>
-            </w:r>
-            <w:r>
-              <w:rPr>
-                <w:rFonts w:ascii="Arial" w:hAnsi="Arial"/>
-                <w:bCs/>
-                <w:noProof/>
-                <w:color w:val="000000" w:themeColor="text1"/>
-                <w:sz w:val="16"/>
-                <w:szCs w:val="16"/>
-              </w:rPr>
-              <w:fldChar w:fldCharType="separate"/>
-            </w:r>
-            <w:r>
-              <w:rPr>
-                <w:rFonts w:ascii="Arial" w:hAnsi="Arial"/>
-                <w:bCs/>
-                <w:noProof/>
-                <w:color w:val="000000" w:themeColor="text1"/>
-                <w:sz w:val="16"/>
-                <w:szCs w:val="16"/>
-              </w:rPr>
-              <w:t>«direc_empresa»</w:t>
-            </w:r>
-            <w:r>
-              <w:rPr>
-                <w:rFonts w:ascii="Arial" w:hAnsi="Arial"/>
-                <w:bCs/>
-                <w:noProof/>
-                <w:color w:val="000000" w:themeColor="text1"/>
-                <w:sz w:val="16"/>
-                <w:szCs w:val="16"/>
-              </w:rPr>
-              <w:fldChar w:fldCharType="end"/>
-            </w:r>
-          </w:p>
-        </w:tc>
-        <w:tc>
-          <w:tcPr>
-            <w:tcW w:w="2674" w:type="dxa"/>
-          </w:tcPr>
-          <w:p>
-            <w:pPr>
-              <w:rPr>
-                <w:rFonts w:ascii="Arial" w:hAnsi="Arial"/>
-                <w:bCs/>
-                <w:color w:val="000000" w:themeColor="text1"/>
-                <w:sz w:val="16"/>
-                <w:szCs w:val="16"/>
-              </w:rPr>
-            </w:pPr>
-            <w:r>
-              <w:rPr>
-                <w:rFonts w:ascii="Arial" w:hAnsi="Arial"/>
-                <w:b/>
-                <w:color w:val="000000" w:themeColor="text1"/>
-                <w:sz w:val="16"/>
-                <w:szCs w:val="16"/>
-                <w:lang w:val="es-PE"/>
-              </w:rPr>
-              <w:t>Fecha de impresión</w:t>
-            </w:r>
-          </w:p>
-        </w:tc>
-        <w:tc>
-          <w:tcPr>
-            <w:tcW w:w="2674" w:type="dxa"/>
-          </w:tcPr>
-          <w:p>
-            <w:pPr>
-              <w:rPr>
-                <w:rFonts w:ascii="Arial" w:hAnsi="Arial"/>
-                <w:bCs/>
-                <w:color w:val="000000" w:themeColor="text1"/>
-                <w:sz w:val="16"/>
-                <w:szCs w:val="16"/>
-              </w:rPr>
-            </w:pPr>
-            <w:r>
-              <w:rPr>
-                <w:rFonts w:ascii="Arial" w:hAnsi="Arial"/>
-                <w:bCs/>
-                <w:color w:val="000000" w:themeColor="text1"/>
-                <w:sz w:val="16"/>
-                <w:szCs w:val="16"/>
-              </w:rPr>
-              <w:fldChar w:fldCharType="begin"/>
-            </w:r>
-            <w:r>
-              <w:rPr>
-                <w:rFonts w:ascii="Arial" w:hAnsi="Arial"/>
-                <w:bCs/>
-                <w:color w:val="000000" w:themeColor="text1"/>
-                <w:sz w:val="16"/>
-                <w:szCs w:val="16"/>
-              </w:rPr>
-              <w:instrText xml:space="preserve"> MERGEFIELD  </w:instrText>
-            </w:r>
-            <w:r>
-              <w:rPr>
-                <w:rFonts w:ascii="Arial" w:hAnsi="Arial"/>
-                <w:bCs/>
-                <w:color w:val="000000" w:themeColor="text1"/>
-                <w:sz w:val="16"/>
-                <w:szCs w:val="16"/>
-              </w:rPr>
-              <w:instrText>fecha_impr</w:instrText>
-            </w:r>
-            <w:r>
-              <w:rPr>
-                <w:rFonts w:ascii="Arial" w:hAnsi="Arial"/>
-                <w:bCs/>
-                <w:color w:val="000000" w:themeColor="text1"/>
-                <w:sz w:val="16"/>
-                <w:szCs w:val="16"/>
-              </w:rPr>
-              <w:instrText xml:space="preserve">  \* MERGEFORMAT </w:instrText>
-            </w:r>
-            <w:r>
-              <w:rPr>
-                <w:rFonts w:ascii="Arial" w:hAnsi="Arial"/>
-                <w:bCs/>
-                <w:color w:val="000000" w:themeColor="text1"/>
-                <w:sz w:val="16"/>
-                <w:szCs w:val="16"/>
-              </w:rPr>
-              <w:fldChar w:fldCharType="separate"/>
-            </w:r>
-            <w:r>
-              <w:rPr>
-                <w:rFonts w:ascii="Arial" w:hAnsi="Arial"/>
-                <w:bCs/>
-                <w:noProof/>
-                <w:color w:val="000000" w:themeColor="text1"/>
-                <w:sz w:val="16"/>
-                <w:szCs w:val="16"/>
-              </w:rPr>
-              <w:t>«fecha_impr»</w:t>
-            </w:r>
-            <w:r>
-              <w:rPr>
-                <w:rFonts w:ascii="Arial" w:hAnsi="Arial"/>
-                <w:bCs/>
-                <w:color w:val="000000" w:themeColor="text1"/>
-                <w:sz w:val="16"/>
-                <w:szCs w:val="16"/>
-              </w:rPr>
-              <w:fldChar w:fldCharType="end"/>
-            </w:r>
-          </w:p>
-        </w:tc>
-      </w:tr>
-      <w:tr>
-        <w:trPr>
-          <w:trHeight w:val="378"/>
-        </w:trPr>
-        <w:tc>
-          <w:tcPr>
-            <w:tcW w:w="1706" w:type="dxa"/>
-          </w:tcPr>
-          <w:p>
-            <w:pPr>
-              <w:rPr>
-                <w:rFonts w:ascii="Arial" w:hAnsi="Arial"/>
-                <w:b/>
-                <w:color w:val="000000" w:themeColor="text1"/>
-                <w:sz w:val="16"/>
-                <w:szCs w:val="16"/>
-                <w:lang w:val="es-PE"/>
-              </w:rPr>
-            </w:pPr>
-            <w:r>
-              <w:rPr>
-                <w:rFonts w:ascii="Arial" w:hAnsi="Arial"/>
-                <w:b/>
-                <w:color w:val="000000" w:themeColor="text1"/>
-                <w:sz w:val="16"/>
-                <w:szCs w:val="16"/>
-                <w:lang w:val="es-PE"/>
-              </w:rPr>
-              <w:t>RUC</w:t>
-            </w:r>
-          </w:p>
-        </w:tc>
-        <w:tc>
-          <w:tcPr>
-            <w:tcW w:w="3642" w:type="dxa"/>
-          </w:tcPr>
-          <w:p>
-            <w:pPr>
-              <w:rPr>
-                <w:rFonts w:ascii="Arial" w:hAnsi="Arial"/>
-                <w:bCs/>
-                <w:color w:val="000000" w:themeColor="text1"/>
-                <w:sz w:val="16"/>
-                <w:szCs w:val="16"/>
-              </w:rPr>
-            </w:pPr>
-            <w:r>
-              <w:rPr>
-                <w:rFonts w:ascii="Arial" w:hAnsi="Arial"/>
-                <w:bCs/>
-                <w:color w:val="000000" w:themeColor="text1"/>
-                <w:sz w:val="16"/>
-                <w:szCs w:val="16"/>
-              </w:rPr>
-              <w:fldChar w:fldCharType="begin"/>
-            </w:r>
-            <w:r>
-              <w:rPr>
-                <w:rFonts w:ascii="Arial" w:hAnsi="Arial"/>
-                <w:bCs/>
-                <w:color w:val="000000" w:themeColor="text1"/>
-                <w:sz w:val="16"/>
-                <w:szCs w:val="16"/>
-              </w:rPr>
-              <w:instrText xml:space="preserve"> MERGEFIELD  ruc_empresa  \* MERGEFORMAT </w:instrText>
-            </w:r>
-            <w:r>
-              <w:rPr>
-                <w:rFonts w:ascii="Arial" w:hAnsi="Arial"/>
-                <w:bCs/>
-                <w:color w:val="000000" w:themeColor="text1"/>
-                <w:sz w:val="16"/>
-                <w:szCs w:val="16"/>
-              </w:rPr>
-              <w:fldChar w:fldCharType="separate"/>
-            </w:r>
-            <w:r>
-              <w:rPr>
-                <w:rFonts w:ascii="Arial" w:hAnsi="Arial"/>
-                <w:bCs/>
-                <w:noProof/>
-                <w:color w:val="000000" w:themeColor="text1"/>
-                <w:sz w:val="16"/>
-                <w:szCs w:val="16"/>
-              </w:rPr>
-              <w:t>«ruc_empresa»</w:t>
-            </w:r>
-            <w:r>
-              <w:rPr>
-                <w:rFonts w:ascii="Arial" w:hAnsi="Arial"/>
-                <w:bCs/>
-                <w:color w:val="000000" w:themeColor="text1"/>
-                <w:sz w:val="16"/>
-                <w:szCs w:val="16"/>
-              </w:rPr>
-              <w:fldChar w:fldCharType="end"/>
-            </w:r>
-          </w:p>
-        </w:tc>
-        <w:tc>
-          <w:tcPr>
-            <w:tcW w:w="2674" w:type="dxa"/>
-          </w:tcPr>
-          <w:p>
-            <w:pPr>
-              <w:rPr>
-                <w:rFonts w:ascii="Arial" w:hAnsi="Arial"/>
-                <w:b/>
-                <w:color w:val="000000" w:themeColor="text1"/>
-                <w:sz w:val="16"/>
-                <w:szCs w:val="16"/>
-                <w:lang w:val="es-PE"/>
-              </w:rPr>
-            </w:pPr>
-            <w:r>
-              <w:rPr>
-                <w:rFonts w:ascii="Arial" w:hAnsi="Arial"/>
-                <w:b/>
-                <w:color w:val="000000" w:themeColor="text1"/>
-                <w:sz w:val="16"/>
-                <w:szCs w:val="16"/>
-                <w:lang w:val="es-PE"/>
-              </w:rPr>
-              <w:t>Hora de impresión</w:t>
-            </w:r>
-          </w:p>
-        </w:tc>
-        <w:tc>
-          <w:tcPr>
-            <w:tcW w:w="2674" w:type="dxa"/>
-          </w:tcPr>
-          <w:p>
-            <w:pPr>
-              <w:rPr>
-                <w:rFonts w:ascii="Arial" w:hAnsi="Arial"/>
-                <w:bCs/>
-                <w:color w:val="000000" w:themeColor="text1"/>
-                <w:sz w:val="16"/>
-                <w:szCs w:val="16"/>
-              </w:rPr>
-            </w:pPr>
-            <w:r>
-              <w:rPr>
-                <w:rFonts w:ascii="Arial" w:hAnsi="Arial"/>
-                <w:bCs/>
-                <w:color w:val="000000" w:themeColor="text1"/>
-                <w:sz w:val="16"/>
-                <w:szCs w:val="16"/>
-              </w:rPr>
-              <w:fldChar w:fldCharType="begin"/>
-            </w:r>
-            <w:r>
-              <w:rPr>
-                <w:rFonts w:ascii="Arial" w:hAnsi="Arial"/>
-                <w:bCs/>
-                <w:color w:val="000000" w:themeColor="text1"/>
-                <w:sz w:val="16"/>
-                <w:szCs w:val="16"/>
-              </w:rPr>
-              <w:instrText xml:space="preserve"> MERGEFIELD  </w:instrText>
-            </w:r>
-            <w:r>
-              <w:rPr>
-                <w:rFonts w:ascii="Arial" w:hAnsi="Arial"/>
-                <w:bCs/>
-                <w:color w:val="000000" w:themeColor="text1"/>
-                <w:sz w:val="16"/>
-                <w:szCs w:val="16"/>
-              </w:rPr>
-              <w:instrText>hora_impr</w:instrText>
-            </w:r>
-            <w:r>
-              <w:rPr>
-                <w:rFonts w:ascii="Arial" w:hAnsi="Arial"/>
-                <w:bCs/>
-                <w:color w:val="000000" w:themeColor="text1"/>
-                <w:sz w:val="16"/>
-                <w:szCs w:val="16"/>
-              </w:rPr>
-              <w:instrText xml:space="preserve">  \* MERGEFORMAT </w:instrText>
-            </w:r>
-            <w:r>
-              <w:rPr>
-                <w:rFonts w:ascii="Arial" w:hAnsi="Arial"/>
-                <w:bCs/>
-                <w:color w:val="000000" w:themeColor="text1"/>
-                <w:sz w:val="16"/>
-                <w:szCs w:val="16"/>
-              </w:rPr>
-              <w:fldChar w:fldCharType="separate"/>
-            </w:r>
-            <w:r>
-              <w:rPr>
-                <w:rFonts w:ascii="Arial" w:hAnsi="Arial"/>
-                <w:bCs/>
-                <w:noProof/>
-                <w:color w:val="000000" w:themeColor="text1"/>
-                <w:sz w:val="16"/>
-                <w:szCs w:val="16"/>
-              </w:rPr>
-              <w:t>«hora_impr»</w:t>
-            </w:r>
-            <w:r>
-              <w:rPr>
-                <w:rFonts w:ascii="Arial" w:hAnsi="Arial"/>
-                <w:bCs/>
-                <w:color w:val="000000" w:themeColor="text1"/>
-                <w:sz w:val="16"/>
-                <w:szCs w:val="16"/>
-              </w:rPr>
-              <w:fldChar w:fldCharType="end"/>
-            </w:r>
-            <w:r>
-              <w:rPr>
-                <w:rFonts w:ascii="Arial" w:hAnsi="Arial"/>
-                <w:bCs/>
-                <w:color w:val="000000" w:themeColor="text1"/>
-                <w:sz w:val="16"/>
-                <w:szCs w:val="16"/>
-              </w:rPr>
-              <w:t xml:space="preserve"> </w:t>
-            </w:r>
-          </w:p>
-        </w:tc>
-      </w:tr>
-      <w:tr>
-        <w:trPr>
-          <w:trHeight w:val="378"/>
-        </w:trPr>
-        <w:tc>
-          <w:tcPr>
-            <w:tcW w:w="1706" w:type="dxa"/>
-          </w:tcPr>
-          <w:p>
-            <w:pPr>
-              <w:rPr>
-                <w:rFonts w:ascii="Arial" w:hAnsi="Arial"/>
-                <w:b/>
-                <w:color w:val="000000" w:themeColor="text1"/>
-                <w:sz w:val="16"/>
-                <w:szCs w:val="16"/>
-                <w:lang w:val="es-PE"/>
-              </w:rPr>
-            </w:pPr>
-            <w:r>
-              <w:rPr>
-                <w:rFonts w:ascii="Arial" w:hAnsi="Arial"/>
-                <w:b/>
-                <w:color w:val="000000" w:themeColor="text1"/>
-                <w:sz w:val="16"/>
-                <w:szCs w:val="16"/>
-                <w:lang w:val="es-PE"/>
-              </w:rPr>
-              <w:t>Teléfono</w:t>
-            </w:r>
-          </w:p>
-        </w:tc>
-        <w:tc>
-          <w:tcPr>
-            <w:tcW w:w="3642" w:type="dxa"/>
-          </w:tcPr>
-          <w:p>
-            <w:pPr>
-              <w:rPr>
-                <w:rFonts w:ascii="Arial" w:hAnsi="Arial"/>
-                <w:bCs/>
-                <w:color w:val="000000" w:themeColor="text1"/>
-                <w:sz w:val="16"/>
-                <w:szCs w:val="16"/>
-              </w:rPr>
-            </w:pPr>
-            <w:r>
-              <w:rPr>
-                <w:rFonts w:ascii="Arial" w:hAnsi="Arial"/>
-                <w:bCs/>
-                <w:color w:val="000000" w:themeColor="text1"/>
-                <w:sz w:val="16"/>
-                <w:szCs w:val="16"/>
-              </w:rPr>
-              <w:fldChar w:fldCharType="begin"/>
-            </w:r>
-            <w:r>
-              <w:rPr>
-                <w:rFonts w:ascii="Arial" w:hAnsi="Arial"/>
-                <w:bCs/>
-                <w:color w:val="000000" w:themeColor="text1"/>
-                <w:sz w:val="16"/>
-                <w:szCs w:val="16"/>
-              </w:rPr>
-              <w:instrText xml:space="preserve"> MERGEFIELD  </w:instrText>
-            </w:r>
-            <w:r>
-              <w:rPr>
-                <w:rFonts w:ascii="Arial" w:hAnsi="Arial"/>
-                <w:bCs/>
-                <w:noProof/>
-                <w:color w:val="000000" w:themeColor="text1"/>
-                <w:sz w:val="16"/>
-                <w:szCs w:val="16"/>
-              </w:rPr>
-              <w:instrText>telefono_empresa</w:instrText>
-            </w:r>
-            <w:r>
-              <w:rPr>
-                <w:rFonts w:ascii="Arial" w:hAnsi="Arial"/>
-                <w:bCs/>
-                <w:color w:val="000000" w:themeColor="text1"/>
-                <w:sz w:val="16"/>
-                <w:szCs w:val="16"/>
-              </w:rPr>
-              <w:instrText xml:space="preserve">  \* MERGEFORMAT </w:instrText>
-            </w:r>
-            <w:r>
-              <w:rPr>
-                <w:rFonts w:ascii="Arial" w:hAnsi="Arial"/>
-                <w:bCs/>
-                <w:color w:val="000000" w:themeColor="text1"/>
-                <w:sz w:val="16"/>
-                <w:szCs w:val="16"/>
-              </w:rPr>
-              <w:fldChar w:fldCharType="separate"/>
-            </w:r>
-            <w:r>
-              <w:rPr>
-                <w:rFonts w:ascii="Arial" w:hAnsi="Arial"/>
-                <w:bCs/>
-                <w:noProof/>
-                <w:color w:val="000000" w:themeColor="text1"/>
-                <w:sz w:val="16"/>
-                <w:szCs w:val="16"/>
-              </w:rPr>
-              <w:t>«telefono_empresa»</w:t>
-            </w:r>
-            <w:r>
-              <w:rPr>
-                <w:rFonts w:ascii="Arial" w:hAnsi="Arial"/>
-                <w:bCs/>
-                <w:color w:val="000000" w:themeColor="text1"/>
-                <w:sz w:val="16"/>
-                <w:szCs w:val="16"/>
-              </w:rPr>
-              <w:fldChar w:fldCharType="end"/>
-            </w:r>
-          </w:p>
-        </w:tc>
-        <w:tc>
-          <w:tcPr>
-            <w:tcW w:w="2674" w:type="dxa"/>
-          </w:tcPr>
-          <w:p>
-            <w:pPr>
-              <w:rPr>
-                <w:rFonts w:ascii="Arial" w:hAnsi="Arial"/>
-                <w:b/>
-                <w:color w:val="000000" w:themeColor="text1"/>
-                <w:sz w:val="16"/>
-                <w:szCs w:val="16"/>
-                <w:lang w:val="es-PE"/>
-              </w:rPr>
-            </w:pPr>
-          </w:p>
-        </w:tc>
-        <w:tc>
-          <w:tcPr>
-            <w:tcW w:w="2674" w:type="dxa"/>
-          </w:tcPr>
-          <w:p>
-            <w:pPr>
-              <w:rPr>
-                <w:rFonts w:ascii="Arial" w:hAnsi="Arial"/>
-                <w:bCs/>
-                <w:color w:val="000000" w:themeColor="text1"/>
-                <w:sz w:val="16"/>
-                <w:szCs w:val="16"/>
-              </w:rPr>
-            </w:pPr>
-          </w:p>
-        </w:tc>
-      </w:tr>
-    </w:tbl>
-    <w:p>
-      <w:pPr>
-        <w:spacing w:line="0" w:lineRule="atLeast"/>
-        <w:rPr>
-          <w:rFonts w:ascii="Arial" w:hAnsi="Arial"/>
-          <w:b/>
-          <w:bCs/>
-          <w:u w:val="single"/>
-          <w:lang w:val="es-PE"/>
-        </w:rPr>
-      </w:pPr>
-    </w:p>
-    <w:tbl>
-      <w:tblPr>
-        <w:tblStyle w:val="Tablaconcuadrculaclara"/>
-        <w:tblW w:w="5000" w:type="pct"/>
+        <w:tblW w:w="5429" w:type="pct"/>
         <w:tblInd w:w="-5" w:type="dxa"/>
         <w:tblBorders>
           <w:top w:val="none" w:sz="0" w:space="0" w:color="auto"/>
@@ -1434,106 +559,262 @@
         <w:tblDescription w:val="Tabla de diseño de encabezado"/>
       </w:tblPr>
       <w:tblGrid>
-        <w:gridCol w:w="1708"/>
-        <w:gridCol w:w="3642"/>
-        <w:gridCol w:w="2673"/>
-        <w:gridCol w:w="2673"/>
+        <w:gridCol w:w="1849"/>
+        <w:gridCol w:w="3945"/>
+        <w:gridCol w:w="2896"/>
+        <w:gridCol w:w="2898"/>
       </w:tblGrid>
       <w:tr>
         <w:trPr>
-          <w:trHeight w:val="378"/>
+          <w:trHeight w:val="375"/>
         </w:trPr>
         <w:tc>
           <w:tcPr>
-            <w:tcW w:w="5344" w:type="dxa"/>
-            <w:gridSpan w:val="2"/>
-          </w:tcPr>
-          <w:p>
-            <w:pPr>
-              <w:rPr>
-                <w:rFonts w:ascii="Arial" w:hAnsi="Arial"/>
-                <w:bCs/>
-                <w:color w:val="000000" w:themeColor="text1"/>
-                <w:sz w:val="16"/>
-                <w:szCs w:val="16"/>
-              </w:rPr>
-            </w:pPr>
-            <w:r>
-              <w:rPr>
-                <w:rFonts w:ascii="Arial" w:hAnsi="Arial"/>
-                <w:b/>
-                <w:bCs/>
-                <w:color w:val="000000" w:themeColor="text1"/>
-                <w:sz w:val="16"/>
-                <w:szCs w:val="16"/>
-                <w:u w:val="single"/>
+            <w:tcW w:w="1854" w:type="dxa"/>
+          </w:tcPr>
+          <w:p>
+            <w:pPr>
+              <w:rPr>
+                <w:rFonts w:ascii="Arial" w:hAnsi="Arial"/>
+                <w:bCs/>
+                <w:color w:val="000000" w:themeColor="text1"/>
+                <w:sz w:val="16"/>
+                <w:szCs w:val="16"/>
+              </w:rPr>
+            </w:pPr>
+            <w:r>
+              <w:rPr>
+                <w:rFonts w:ascii="Arial" w:hAnsi="Arial"/>
+                <w:b/>
+                <w:color w:val="000000" w:themeColor="text1"/>
+                <w:sz w:val="16"/>
+                <w:szCs w:val="16"/>
                 <w:lang w:val="es-PE"/>
               </w:rPr>
-              <w:t>Información</w:t>
-            </w:r>
-            <w:r>
-              <w:rPr>
-                <w:rFonts w:ascii="Arial" w:hAnsi="Arial"/>
-                <w:b/>
-                <w:bCs/>
-                <w:color w:val="000000" w:themeColor="text1"/>
-                <w:sz w:val="16"/>
-                <w:szCs w:val="16"/>
-                <w:u w:val="single"/>
+              <w:t>Sede Productiva</w:t>
+            </w:r>
+          </w:p>
+        </w:tc>
+        <w:tc>
+          <w:tcPr>
+            <w:tcW w:w="3955" w:type="dxa"/>
+          </w:tcPr>
+          <w:p>
+            <w:pPr>
+              <w:rPr>
+                <w:rFonts w:ascii="Arial" w:hAnsi="Arial"/>
+                <w:bCs/>
+                <w:color w:val="000000" w:themeColor="text1"/>
+                <w:sz w:val="16"/>
+                <w:szCs w:val="16"/>
+              </w:rPr>
+            </w:pPr>
+            <w:r>
+              <w:rPr>
+                <w:rFonts w:ascii="Arial" w:hAnsi="Arial"/>
+                <w:bCs/>
+                <w:color w:val="000000" w:themeColor="text1"/>
+                <w:sz w:val="16"/>
+                <w:szCs w:val="16"/>
+              </w:rPr>
+              <w:fldChar w:fldCharType="begin"/>
+            </w:r>
+            <w:r>
+              <w:rPr>
+                <w:rFonts w:ascii="Arial" w:hAnsi="Arial"/>
+                <w:bCs/>
+                <w:color w:val="000000" w:themeColor="text1"/>
+                <w:sz w:val="16"/>
+                <w:szCs w:val="16"/>
+              </w:rPr>
+              <w:instrText xml:space="preserve"> MERGEFIELD  </w:instrText>
+            </w:r>
+            <w:r>
+              <w:rPr>
+                <w:rFonts w:ascii="Arial" w:hAnsi="Arial"/>
+                <w:bCs/>
+                <w:noProof/>
+                <w:color w:val="000000" w:themeColor="text1"/>
+                <w:sz w:val="16"/>
+                <w:szCs w:val="16"/>
+              </w:rPr>
+              <w:instrText>sucursal_empresa</w:instrText>
+            </w:r>
+            <w:r>
+              <w:rPr>
+                <w:rFonts w:ascii="Arial" w:hAnsi="Arial"/>
+                <w:bCs/>
+                <w:color w:val="000000" w:themeColor="text1"/>
+                <w:sz w:val="16"/>
+                <w:szCs w:val="16"/>
+              </w:rPr>
+              <w:instrText xml:space="preserve">  \* MERGEFORMAT </w:instrText>
+            </w:r>
+            <w:r>
+              <w:rPr>
+                <w:rFonts w:ascii="Arial" w:hAnsi="Arial"/>
+                <w:bCs/>
+                <w:color w:val="000000" w:themeColor="text1"/>
+                <w:sz w:val="16"/>
+                <w:szCs w:val="16"/>
+              </w:rPr>
+              <w:fldChar w:fldCharType="separate"/>
+            </w:r>
+            <w:r>
+              <w:rPr>
+                <w:rFonts w:ascii="Arial" w:hAnsi="Arial"/>
+                <w:bCs/>
+                <w:noProof/>
+                <w:color w:val="000000" w:themeColor="text1"/>
+                <w:sz w:val="16"/>
+                <w:szCs w:val="16"/>
+              </w:rPr>
+              <w:t>«sucursal_empresa»</w:t>
+            </w:r>
+            <w:r>
+              <w:rPr>
+                <w:rFonts w:ascii="Arial" w:hAnsi="Arial"/>
+                <w:bCs/>
+                <w:color w:val="000000" w:themeColor="text1"/>
+                <w:sz w:val="16"/>
+                <w:szCs w:val="16"/>
+              </w:rPr>
+              <w:fldChar w:fldCharType="end"/>
+            </w:r>
+          </w:p>
+        </w:tc>
+        <w:tc>
+          <w:tcPr>
+            <w:tcW w:w="2903" w:type="dxa"/>
+          </w:tcPr>
+          <w:p>
+            <w:pPr>
+              <w:rPr>
+                <w:rFonts w:ascii="Arial" w:hAnsi="Arial"/>
+                <w:bCs/>
+                <w:color w:val="000000" w:themeColor="text1"/>
+                <w:sz w:val="16"/>
+                <w:szCs w:val="16"/>
+              </w:rPr>
+            </w:pPr>
+            <w:proofErr w:type="gramStart"/>
+            <w:r>
+              <w:rPr>
+                <w:rFonts w:ascii="Arial" w:hAnsi="Arial"/>
+                <w:b/>
+                <w:color w:val="000000" w:themeColor="text1"/>
+                <w:sz w:val="16"/>
+                <w:szCs w:val="16"/>
                 <w:lang w:val="es-PE"/>
               </w:rPr>
-              <w:t xml:space="preserve"> Comercial</w:t>
-            </w:r>
-          </w:p>
-        </w:tc>
-        <w:tc>
-          <w:tcPr>
-            <w:tcW w:w="5342" w:type="dxa"/>
-            <w:gridSpan w:val="2"/>
-          </w:tcPr>
-          <w:p>
-            <w:pPr>
-              <w:rPr>
-                <w:rFonts w:ascii="Arial" w:hAnsi="Arial"/>
-                <w:b/>
-                <w:color w:val="000000" w:themeColor="text1"/>
-                <w:sz w:val="16"/>
-                <w:szCs w:val="16"/>
-                <w:u w:val="single"/>
-              </w:rPr>
-            </w:pPr>
-            <w:r>
-              <w:rPr>
-                <w:rFonts w:ascii="Arial" w:hAnsi="Arial"/>
-                <w:b/>
-                <w:color w:val="000000" w:themeColor="text1"/>
-                <w:sz w:val="16"/>
-                <w:szCs w:val="16"/>
-                <w:u w:val="single"/>
-              </w:rPr>
-              <w:t>Información</w:t>
-            </w:r>
-            <w:r>
-              <w:rPr>
-                <w:rFonts w:ascii="Arial" w:hAnsi="Arial"/>
-                <w:b/>
-                <w:color w:val="000000" w:themeColor="text1"/>
-                <w:sz w:val="16"/>
-                <w:szCs w:val="16"/>
-                <w:u w:val="single"/>
-              </w:rPr>
-              <w:t xml:space="preserve"> Transportista</w:t>
+              <w:t>Ticket</w:t>
+            </w:r>
+            <w:proofErr w:type="gramEnd"/>
+            <w:r>
+              <w:rPr>
+                <w:rFonts w:ascii="Arial" w:hAnsi="Arial"/>
+                <w:b/>
+                <w:color w:val="000000" w:themeColor="text1"/>
+                <w:sz w:val="16"/>
+                <w:szCs w:val="16"/>
+                <w:lang w:val="es-PE"/>
+              </w:rPr>
+              <w:t xml:space="preserve"> de Pesaje </w:t>
+            </w:r>
+            <w:proofErr w:type="spellStart"/>
+            <w:r>
+              <w:rPr>
+                <w:rFonts w:ascii="Arial" w:hAnsi="Arial"/>
+                <w:b/>
+                <w:color w:val="000000" w:themeColor="text1"/>
+                <w:sz w:val="16"/>
+                <w:szCs w:val="16"/>
+                <w:lang w:val="es-PE"/>
+              </w:rPr>
+              <w:t>N°</w:t>
+            </w:r>
+            <w:proofErr w:type="spellEnd"/>
+          </w:p>
+        </w:tc>
+        <w:tc>
+          <w:tcPr>
+            <w:tcW w:w="2904" w:type="dxa"/>
+          </w:tcPr>
+          <w:p>
+            <w:pPr>
+              <w:rPr>
+                <w:rFonts w:ascii="Arial" w:hAnsi="Arial"/>
+                <w:bCs/>
+                <w:color w:val="000000" w:themeColor="text1"/>
+                <w:sz w:val="16"/>
+                <w:szCs w:val="16"/>
+              </w:rPr>
+            </w:pPr>
+            <w:r>
+              <w:rPr>
+                <w:rFonts w:ascii="Arial" w:hAnsi="Arial"/>
+                <w:bCs/>
+                <w:noProof/>
+                <w:color w:val="000000" w:themeColor="text1"/>
+                <w:sz w:val="16"/>
+                <w:szCs w:val="16"/>
+              </w:rPr>
+              <w:fldChar w:fldCharType="begin"/>
+            </w:r>
+            <w:r>
+              <w:rPr>
+                <w:rFonts w:ascii="Arial" w:hAnsi="Arial"/>
+                <w:bCs/>
+                <w:noProof/>
+                <w:color w:val="000000" w:themeColor="text1"/>
+                <w:sz w:val="16"/>
+                <w:szCs w:val="16"/>
+              </w:rPr>
+              <w:instrText xml:space="preserve"> MERGEFIELD  nro_ticket  \* MERGEFORMAT </w:instrText>
+            </w:r>
+            <w:r>
+              <w:rPr>
+                <w:rFonts w:ascii="Arial" w:hAnsi="Arial"/>
+                <w:bCs/>
+                <w:noProof/>
+                <w:color w:val="000000" w:themeColor="text1"/>
+                <w:sz w:val="16"/>
+                <w:szCs w:val="16"/>
+              </w:rPr>
+              <w:fldChar w:fldCharType="separate"/>
+            </w:r>
+            <w:r>
+              <w:rPr>
+                <w:rFonts w:ascii="Arial" w:hAnsi="Arial"/>
+                <w:bCs/>
+                <w:noProof/>
+                <w:color w:val="000000" w:themeColor="text1"/>
+                <w:sz w:val="16"/>
+                <w:szCs w:val="16"/>
+              </w:rPr>
+              <w:t>«nro_ticket»</w:t>
+            </w:r>
+            <w:r>
+              <w:rPr>
+                <w:rFonts w:ascii="Arial" w:hAnsi="Arial"/>
+                <w:bCs/>
+                <w:noProof/>
+                <w:color w:val="000000" w:themeColor="text1"/>
+                <w:sz w:val="16"/>
+                <w:szCs w:val="16"/>
+              </w:rPr>
+              <w:fldChar w:fldCharType="end"/>
             </w:r>
           </w:p>
         </w:tc>
       </w:tr>
       <w:tr>
         <w:trPr>
-          <w:trHeight w:val="529"/>
+          <w:trHeight w:val="375"/>
         </w:trPr>
         <w:tc>
           <w:tcPr>
-            <w:tcW w:w="1705" w:type="dxa"/>
+            <w:tcW w:w="1854" w:type="dxa"/>
           </w:tcPr>
           <w:p>
             <w:pPr>
@@ -1554,8 +835,95 @@
                 <w:szCs w:val="16"/>
                 <w:lang w:val="es-PE"/>
               </w:rPr>
-              <w:t>P</w:t>
-            </w:r>
+              <w:t xml:space="preserve">Dirección </w:t>
+            </w:r>
+          </w:p>
+        </w:tc>
+        <w:tc>
+          <w:tcPr>
+            <w:tcW w:w="3955" w:type="dxa"/>
+          </w:tcPr>
+          <w:p>
+            <w:pPr>
+              <w:rPr>
+                <w:rFonts w:ascii="Arial" w:hAnsi="Arial"/>
+                <w:bCs/>
+                <w:color w:val="000000" w:themeColor="text1"/>
+                <w:sz w:val="16"/>
+                <w:szCs w:val="16"/>
+              </w:rPr>
+            </w:pPr>
+            <w:r>
+              <w:rPr>
+                <w:rFonts w:ascii="Arial" w:hAnsi="Arial"/>
+                <w:bCs/>
+                <w:noProof/>
+                <w:color w:val="000000" w:themeColor="text1"/>
+                <w:sz w:val="16"/>
+                <w:szCs w:val="16"/>
+              </w:rPr>
+              <w:fldChar w:fldCharType="begin"/>
+            </w:r>
+            <w:r>
+              <w:rPr>
+                <w:rFonts w:ascii="Arial" w:hAnsi="Arial"/>
+                <w:bCs/>
+                <w:noProof/>
+                <w:color w:val="000000" w:themeColor="text1"/>
+                <w:sz w:val="16"/>
+                <w:szCs w:val="16"/>
+              </w:rPr>
+              <w:instrText xml:space="preserve"> MERGEFIELD  direc_empresa  \* MERGEFORMAT </w:instrText>
+            </w:r>
+            <w:r>
+              <w:rPr>
+                <w:rFonts w:ascii="Arial" w:hAnsi="Arial"/>
+                <w:bCs/>
+                <w:noProof/>
+                <w:color w:val="000000" w:themeColor="text1"/>
+                <w:sz w:val="16"/>
+                <w:szCs w:val="16"/>
+              </w:rPr>
+              <w:fldChar w:fldCharType="separate"/>
+            </w:r>
+            <w:r>
+              <w:rPr>
+                <w:rFonts w:ascii="Arial" w:hAnsi="Arial"/>
+                <w:bCs/>
+                <w:noProof/>
+                <w:color w:val="000000" w:themeColor="text1"/>
+                <w:sz w:val="16"/>
+                <w:szCs w:val="16"/>
+              </w:rPr>
+              <w:t>«direc_empresa»</w:t>
+            </w:r>
+            <w:r>
+              <w:rPr>
+                <w:rFonts w:ascii="Arial" w:hAnsi="Arial"/>
+                <w:bCs/>
+                <w:noProof/>
+                <w:color w:val="000000" w:themeColor="text1"/>
+                <w:sz w:val="16"/>
+                <w:szCs w:val="16"/>
+              </w:rPr>
+              <w:fldChar w:fldCharType="end"/>
+            </w:r>
+          </w:p>
+        </w:tc>
+        <w:tc>
+          <w:tcPr>
+            <w:tcW w:w="2903" w:type="dxa"/>
+          </w:tcPr>
+          <w:p>
+            <w:pPr>
+              <w:rPr>
+                <w:rFonts w:ascii="Arial" w:hAnsi="Arial"/>
+                <w:bCs/>
+                <w:color w:val="000000" w:themeColor="text1"/>
+                <w:sz w:val="16"/>
+                <w:szCs w:val="16"/>
+              </w:rPr>
+            </w:pPr>
             <w:r>
               <w:rPr>
                 <w:rFonts w:ascii="Arial" w:hAnsi="Arial"/>
@@ -1565,29 +933,28 @@
                 <w:szCs w:val="16"/>
                 <w:lang w:val="es-PE"/>
               </w:rPr>
-              <w:t>roveedor</w:t>
-            </w:r>
-          </w:p>
-        </w:tc>
-        <w:tc>
-          <w:tcPr>
-            <w:tcW w:w="3639" w:type="dxa"/>
-          </w:tcPr>
-          <w:p>
-            <w:pPr>
-              <w:rPr>
-                <w:rFonts w:ascii="Arial" w:hAnsi="Arial"/>
-                <w:bCs/>
-                <w:color w:val="000000" w:themeColor="text1"/>
-                <w:sz w:val="16"/>
-                <w:szCs w:val="16"/>
-              </w:rPr>
-            </w:pPr>
-            <w:r>
-              <w:rPr>
-                <w:rFonts w:ascii="Arial" w:hAnsi="Arial"/>
-                <w:bCs/>
-                <w:noProof/>
+              <w:t>Fecha de impresión</w:t>
+            </w:r>
+          </w:p>
+        </w:tc>
+        <w:tc>
+          <w:tcPr>
+            <w:tcW w:w="2904" w:type="dxa"/>
+          </w:tcPr>
+          <w:p>
+            <w:pPr>
+              <w:rPr>
+                <w:rFonts w:ascii="Arial" w:hAnsi="Arial"/>
+                <w:bCs/>
+                <w:color w:val="000000" w:themeColor="text1"/>
+                <w:sz w:val="16"/>
+                <w:szCs w:val="16"/>
+              </w:rPr>
+            </w:pPr>
+            <w:r>
+              <w:rPr>
+                <w:rFonts w:ascii="Arial" w:hAnsi="Arial"/>
+                <w:bCs/>
                 <w:color w:val="000000" w:themeColor="text1"/>
                 <w:sz w:val="16"/>
                 <w:szCs w:val="16"/>
@@ -1598,18 +965,36 @@
               <w:rPr>
                 <w:rFonts w:ascii="Arial" w:hAnsi="Arial"/>
                 <w:bCs/>
-                <w:noProof/>
-                <w:color w:val="000000" w:themeColor="text1"/>
-                <w:sz w:val="16"/>
-                <w:szCs w:val="16"/>
-              </w:rPr>
-              <w:instrText xml:space="preserve"> MERGEFIELD  razon_social  \* MERGEFORMAT </w:instrText>
-            </w:r>
-            <w:r>
-              <w:rPr>
-                <w:rFonts w:ascii="Arial" w:hAnsi="Arial"/>
-                <w:bCs/>
-                <w:noProof/>
+                <w:color w:val="000000" w:themeColor="text1"/>
+                <w:sz w:val="16"/>
+                <w:szCs w:val="16"/>
+              </w:rPr>
+              <w:instrText xml:space="preserve"> MERGEFIELD  </w:instrText>
+            </w:r>
+            <w:r>
+              <w:rPr>
+                <w:rFonts w:ascii="Arial" w:hAnsi="Arial"/>
+                <w:bCs/>
+                <w:color w:val="000000" w:themeColor="text1"/>
+                <w:sz w:val="16"/>
+                <w:szCs w:val="16"/>
+              </w:rPr>
+              <w:instrText>fecha_impr</w:instrText>
+            </w:r>
+            <w:r>
+              <w:rPr>
+                <w:rFonts w:ascii="Arial" w:hAnsi="Arial"/>
+                <w:bCs/>
+                <w:color w:val="000000" w:themeColor="text1"/>
+                <w:sz w:val="16"/>
+                <w:szCs w:val="16"/>
+              </w:rPr>
+              <w:instrText xml:space="preserve">  \* MERGEFORMAT </w:instrText>
+            </w:r>
+            <w:r>
+              <w:rPr>
+                <w:rFonts w:ascii="Arial" w:hAnsi="Arial"/>
+                <w:bCs/>
                 <w:color w:val="000000" w:themeColor="text1"/>
                 <w:sz w:val="16"/>
                 <w:szCs w:val="16"/>
@@ -1625,102 +1010,7 @@
                 <w:sz w:val="16"/>
                 <w:szCs w:val="16"/>
               </w:rPr>
-              <w:t>«razon_social»</w:t>
-            </w:r>
-            <w:r>
-              <w:rPr>
-                <w:rFonts w:ascii="Arial" w:hAnsi="Arial"/>
-                <w:bCs/>
-                <w:noProof/>
-                <w:color w:val="000000" w:themeColor="text1"/>
-                <w:sz w:val="16"/>
-                <w:szCs w:val="16"/>
-              </w:rPr>
-              <w:fldChar w:fldCharType="end"/>
-            </w:r>
-          </w:p>
-        </w:tc>
-        <w:tc>
-          <w:tcPr>
-            <w:tcW w:w="2671" w:type="dxa"/>
-          </w:tcPr>
-          <w:p>
-            <w:pPr>
-              <w:rPr>
-                <w:rFonts w:ascii="Arial" w:hAnsi="Arial"/>
-                <w:bCs/>
-                <w:color w:val="000000" w:themeColor="text1"/>
-                <w:sz w:val="16"/>
-                <w:szCs w:val="16"/>
-              </w:rPr>
-            </w:pPr>
-            <w:r>
-              <w:rPr>
-                <w:rFonts w:ascii="Arial" w:hAnsi="Arial"/>
-                <w:b/>
-                <w:color w:val="000000" w:themeColor="text1"/>
-                <w:sz w:val="16"/>
-                <w:szCs w:val="16"/>
-                <w:lang w:val="es-PE"/>
-              </w:rPr>
-              <w:t>Nombre(s)</w:t>
-            </w:r>
-          </w:p>
-        </w:tc>
-        <w:tc>
-          <w:tcPr>
-            <w:tcW w:w="2671" w:type="dxa"/>
-          </w:tcPr>
-          <w:p>
-            <w:pPr>
-              <w:rPr>
-                <w:rFonts w:ascii="Arial" w:hAnsi="Arial"/>
-                <w:bCs/>
-                <w:color w:val="000000" w:themeColor="text1"/>
-                <w:sz w:val="16"/>
-                <w:szCs w:val="16"/>
-              </w:rPr>
-            </w:pPr>
-            <w:r>
-              <w:rPr>
-                <w:rFonts w:ascii="Arial" w:hAnsi="Arial"/>
-                <w:bCs/>
-                <w:color w:val="000000" w:themeColor="text1"/>
-                <w:sz w:val="16"/>
-                <w:szCs w:val="16"/>
-              </w:rPr>
-              <w:fldChar w:fldCharType="begin"/>
-            </w:r>
-            <w:r>
-              <w:rPr>
-                <w:rFonts w:ascii="Arial" w:hAnsi="Arial"/>
-                <w:bCs/>
-                <w:color w:val="000000" w:themeColor="text1"/>
-                <w:sz w:val="16"/>
-                <w:szCs w:val="16"/>
-              </w:rPr>
-              <w:instrText xml:space="preserve"> MERGEFIELD  nom_conductor  \* MERGEFORMAT </w:instrText>
-            </w:r>
-            <w:r>
-              <w:rPr>
-                <w:rFonts w:ascii="Arial" w:hAnsi="Arial"/>
-                <w:bCs/>
-                <w:color w:val="000000" w:themeColor="text1"/>
-                <w:sz w:val="16"/>
-                <w:szCs w:val="16"/>
-              </w:rPr>
-              <w:fldChar w:fldCharType="separate"/>
-            </w:r>
-            <w:r>
-              <w:rPr>
-                <w:rFonts w:ascii="Arial" w:hAnsi="Arial"/>
-                <w:bCs/>
-                <w:noProof/>
-                <w:color w:val="000000" w:themeColor="text1"/>
-                <w:sz w:val="16"/>
-                <w:szCs w:val="16"/>
-              </w:rPr>
-              <w:t>«nom_conductor»</w:t>
+              <w:t>«fecha_impr»</w:t>
             </w:r>
             <w:r>
               <w:rPr>
@@ -1737,23 +1027,14 @@
       </w:tr>
       <w:tr>
         <w:trPr>
-          <w:trHeight w:val="437"/>
+          <w:trHeight w:val="375"/>
         </w:trPr>
         <w:tc>
           <w:tcPr>
-            <w:tcW w:w="1705" w:type="dxa"/>
-          </w:tcPr>
-          <w:p>
-            <w:pPr>
-              <w:rPr>
-                <w:rFonts w:ascii="Arial" w:hAnsi="Arial"/>
-                <w:bCs/>
-                <w:color w:val="000000" w:themeColor="text1"/>
-                <w:sz w:val="16"/>
-                <w:szCs w:val="16"/>
-              </w:rPr>
-            </w:pPr>
-            <w:r>
+            <w:tcW w:w="1854" w:type="dxa"/>
+          </w:tcPr>
+          <w:p>
+            <w:pPr>
               <w:rPr>
                 <w:rFonts w:ascii="Arial" w:hAnsi="Arial"/>
                 <w:b/>
@@ -1762,9 +1043,93 @@
                 <w:szCs w:val="16"/>
                 <w:lang w:val="es-PE"/>
               </w:rPr>
+            </w:pPr>
+            <w:r>
+              <w:rPr>
+                <w:rFonts w:ascii="Arial" w:hAnsi="Arial"/>
+                <w:b/>
+                <w:color w:val="000000" w:themeColor="text1"/>
+                <w:sz w:val="16"/>
+                <w:szCs w:val="16"/>
+                <w:lang w:val="es-PE"/>
+              </w:rPr>
               <w:t>RUC</w:t>
             </w:r>
-            <w:r>
+          </w:p>
+        </w:tc>
+        <w:tc>
+          <w:tcPr>
+            <w:tcW w:w="3955" w:type="dxa"/>
+          </w:tcPr>
+          <w:p>
+            <w:pPr>
+              <w:rPr>
+                <w:rFonts w:ascii="Arial" w:hAnsi="Arial"/>
+                <w:bCs/>
+                <w:color w:val="000000" w:themeColor="text1"/>
+                <w:sz w:val="16"/>
+                <w:szCs w:val="16"/>
+              </w:rPr>
+            </w:pPr>
+            <w:r>
+              <w:rPr>
+                <w:rFonts w:ascii="Arial" w:hAnsi="Arial"/>
+                <w:bCs/>
+                <w:color w:val="000000" w:themeColor="text1"/>
+                <w:sz w:val="16"/>
+                <w:szCs w:val="16"/>
+              </w:rPr>
+              <w:fldChar w:fldCharType="begin"/>
+            </w:r>
+            <w:r>
+              <w:rPr>
+                <w:rFonts w:ascii="Arial" w:hAnsi="Arial"/>
+                <w:bCs/>
+                <w:color w:val="000000" w:themeColor="text1"/>
+                <w:sz w:val="16"/>
+                <w:szCs w:val="16"/>
+              </w:rPr>
+              <w:instrText xml:space="preserve"> MERGEFIELD  ruc_empresa  \* MERGEFORMAT </w:instrText>
+            </w:r>
+            <w:r>
+              <w:rPr>
+                <w:rFonts w:ascii="Arial" w:hAnsi="Arial"/>
+                <w:bCs/>
+                <w:color w:val="000000" w:themeColor="text1"/>
+                <w:sz w:val="16"/>
+                <w:szCs w:val="16"/>
+              </w:rPr>
+              <w:fldChar w:fldCharType="separate"/>
+            </w:r>
+            <w:r>
+              <w:rPr>
+                <w:rFonts w:ascii="Arial" w:hAnsi="Arial"/>
+                <w:bCs/>
+                <w:noProof/>
+                <w:color w:val="000000" w:themeColor="text1"/>
+                <w:sz w:val="16"/>
+                <w:szCs w:val="16"/>
+              </w:rPr>
+              <w:t>«ruc_empresa»</w:t>
+            </w:r>
+            <w:r>
+              <w:rPr>
+                <w:rFonts w:ascii="Arial" w:hAnsi="Arial"/>
+                <w:bCs/>
+                <w:color w:val="000000" w:themeColor="text1"/>
+                <w:sz w:val="16"/>
+                <w:szCs w:val="16"/>
+              </w:rPr>
+              <w:fldChar w:fldCharType="end"/>
+            </w:r>
+          </w:p>
+        </w:tc>
+        <w:tc>
+          <w:tcPr>
+            <w:tcW w:w="2903" w:type="dxa"/>
+          </w:tcPr>
+          <w:p>
+            <w:pPr>
               <w:rPr>
                 <w:rFonts w:ascii="Arial" w:hAnsi="Arial"/>
                 <w:b/>
@@ -1773,192 +1138,128 @@
                 <w:szCs w:val="16"/>
                 <w:lang w:val="es-PE"/>
               </w:rPr>
+            </w:pPr>
+            <w:r>
+              <w:rPr>
+                <w:rFonts w:ascii="Arial" w:hAnsi="Arial"/>
+                <w:b/>
+                <w:color w:val="000000" w:themeColor="text1"/>
+                <w:sz w:val="16"/>
+                <w:szCs w:val="16"/>
+                <w:lang w:val="es-PE"/>
+              </w:rPr>
+              <w:t>Hora de impresión</w:t>
+            </w:r>
+          </w:p>
+        </w:tc>
+        <w:tc>
+          <w:tcPr>
+            <w:tcW w:w="2904" w:type="dxa"/>
+          </w:tcPr>
+          <w:p>
+            <w:pPr>
+              <w:rPr>
+                <w:rFonts w:ascii="Arial" w:hAnsi="Arial"/>
+                <w:bCs/>
+                <w:color w:val="000000" w:themeColor="text1"/>
+                <w:sz w:val="16"/>
+                <w:szCs w:val="16"/>
+              </w:rPr>
+            </w:pPr>
+            <w:r>
+              <w:rPr>
+                <w:rFonts w:ascii="Arial" w:hAnsi="Arial"/>
+                <w:bCs/>
+                <w:color w:val="000000" w:themeColor="text1"/>
+                <w:sz w:val="16"/>
+                <w:szCs w:val="16"/>
+              </w:rPr>
+              <w:fldChar w:fldCharType="begin"/>
+            </w:r>
+            <w:r>
+              <w:rPr>
+                <w:rFonts w:ascii="Arial" w:hAnsi="Arial"/>
+                <w:bCs/>
+                <w:color w:val="000000" w:themeColor="text1"/>
+                <w:sz w:val="16"/>
+                <w:szCs w:val="16"/>
+              </w:rPr>
+              <w:instrText xml:space="preserve"> MERGEFIELD  </w:instrText>
+            </w:r>
+            <w:r>
+              <w:rPr>
+                <w:rFonts w:ascii="Arial" w:hAnsi="Arial"/>
+                <w:bCs/>
+                <w:color w:val="000000" w:themeColor="text1"/>
+                <w:sz w:val="16"/>
+                <w:szCs w:val="16"/>
+              </w:rPr>
+              <w:instrText>hora_impr</w:instrText>
+            </w:r>
+            <w:r>
+              <w:rPr>
+                <w:rFonts w:ascii="Arial" w:hAnsi="Arial"/>
+                <w:bCs/>
+                <w:color w:val="000000" w:themeColor="text1"/>
+                <w:sz w:val="16"/>
+                <w:szCs w:val="16"/>
+              </w:rPr>
+              <w:instrText xml:space="preserve">  \* MERGEFORMAT </w:instrText>
+            </w:r>
+            <w:r>
+              <w:rPr>
+                <w:rFonts w:ascii="Arial" w:hAnsi="Arial"/>
+                <w:bCs/>
+                <w:color w:val="000000" w:themeColor="text1"/>
+                <w:sz w:val="16"/>
+                <w:szCs w:val="16"/>
+              </w:rPr>
+              <w:fldChar w:fldCharType="separate"/>
+            </w:r>
+            <w:r>
+              <w:rPr>
+                <w:rFonts w:ascii="Arial" w:hAnsi="Arial"/>
+                <w:bCs/>
+                <w:noProof/>
+                <w:color w:val="000000" w:themeColor="text1"/>
+                <w:sz w:val="16"/>
+                <w:szCs w:val="16"/>
+              </w:rPr>
+              <w:t>«hora_impr»</w:t>
+            </w:r>
+            <w:r>
+              <w:rPr>
+                <w:rFonts w:ascii="Arial" w:hAnsi="Arial"/>
+                <w:bCs/>
+                <w:color w:val="000000" w:themeColor="text1"/>
+                <w:sz w:val="16"/>
+                <w:szCs w:val="16"/>
+              </w:rPr>
+              <w:fldChar w:fldCharType="end"/>
+            </w:r>
+            <w:r>
+              <w:rPr>
+                <w:rFonts w:ascii="Arial" w:hAnsi="Arial"/>
+                <w:bCs/>
+                <w:color w:val="000000" w:themeColor="text1"/>
+                <w:sz w:val="16"/>
+                <w:szCs w:val="16"/>
+              </w:rPr>
               <w:t xml:space="preserve"> </w:t>
-            </w:r>
-          </w:p>
-        </w:tc>
-        <w:tc>
-          <w:tcPr>
-            <w:tcW w:w="3639" w:type="dxa"/>
-          </w:tcPr>
-          <w:p>
-            <w:pPr>
-              <w:rPr>
-                <w:rFonts w:ascii="Arial" w:hAnsi="Arial"/>
-                <w:bCs/>
-                <w:color w:val="000000" w:themeColor="text1"/>
-                <w:sz w:val="16"/>
-                <w:szCs w:val="16"/>
-              </w:rPr>
-            </w:pPr>
-            <w:r>
-              <w:rPr>
-                <w:rFonts w:ascii="Arial" w:hAnsi="Arial"/>
-                <w:bCs/>
-                <w:color w:val="000000" w:themeColor="text1"/>
-                <w:sz w:val="16"/>
-                <w:szCs w:val="16"/>
-              </w:rPr>
-              <w:fldChar w:fldCharType="begin"/>
-            </w:r>
-            <w:r>
-              <w:rPr>
-                <w:rFonts w:ascii="Arial" w:hAnsi="Arial"/>
-                <w:bCs/>
-                <w:color w:val="000000" w:themeColor="text1"/>
-                <w:sz w:val="16"/>
-                <w:szCs w:val="16"/>
-              </w:rPr>
-              <w:instrText xml:space="preserve"> MERGEFIELD  nro_documento  \* MERGEFORMAT </w:instrText>
-            </w:r>
-            <w:r>
-              <w:rPr>
-                <w:rFonts w:ascii="Arial" w:hAnsi="Arial"/>
-                <w:bCs/>
-                <w:color w:val="000000" w:themeColor="text1"/>
-                <w:sz w:val="16"/>
-                <w:szCs w:val="16"/>
-              </w:rPr>
-              <w:fldChar w:fldCharType="separate"/>
-            </w:r>
-            <w:r>
-              <w:rPr>
-                <w:rFonts w:ascii="Arial" w:hAnsi="Arial"/>
-                <w:bCs/>
-                <w:noProof/>
-                <w:color w:val="000000" w:themeColor="text1"/>
-                <w:sz w:val="16"/>
-                <w:szCs w:val="16"/>
-              </w:rPr>
-              <w:t>«nro_documento»</w:t>
-            </w:r>
-            <w:r>
-              <w:rPr>
-                <w:rFonts w:ascii="Arial" w:hAnsi="Arial"/>
-                <w:bCs/>
-                <w:color w:val="000000" w:themeColor="text1"/>
-                <w:sz w:val="16"/>
-                <w:szCs w:val="16"/>
-              </w:rPr>
-              <w:fldChar w:fldCharType="end"/>
-            </w:r>
-          </w:p>
-        </w:tc>
-        <w:tc>
-          <w:tcPr>
-            <w:tcW w:w="2671" w:type="dxa"/>
-          </w:tcPr>
-          <w:p>
-            <w:pPr>
-              <w:rPr>
-                <w:rFonts w:ascii="Arial" w:hAnsi="Arial"/>
-                <w:bCs/>
-                <w:color w:val="000000" w:themeColor="text1"/>
-                <w:sz w:val="16"/>
-                <w:szCs w:val="16"/>
-              </w:rPr>
-            </w:pPr>
-            <w:r>
-              <w:rPr>
-                <w:rFonts w:ascii="Arial" w:hAnsi="Arial"/>
-                <w:b/>
-                <w:color w:val="000000" w:themeColor="text1"/>
-                <w:sz w:val="16"/>
-                <w:szCs w:val="16"/>
-                <w:lang w:val="es-PE"/>
-              </w:rPr>
-              <w:t>Empresa</w:t>
-            </w:r>
-          </w:p>
-        </w:tc>
-        <w:tc>
-          <w:tcPr>
-            <w:tcW w:w="2671" w:type="dxa"/>
-          </w:tcPr>
-          <w:p>
-            <w:pPr>
-              <w:rPr>
-                <w:rFonts w:ascii="Arial" w:hAnsi="Arial"/>
-                <w:bCs/>
-                <w:color w:val="000000" w:themeColor="text1"/>
-                <w:sz w:val="16"/>
-                <w:szCs w:val="16"/>
-              </w:rPr>
-            </w:pPr>
-            <w:r>
-              <w:rPr>
-                <w:rFonts w:ascii="Arial" w:hAnsi="Arial"/>
-                <w:bCs/>
-                <w:color w:val="000000" w:themeColor="text1"/>
-                <w:sz w:val="16"/>
-                <w:szCs w:val="16"/>
-              </w:rPr>
-              <w:fldChar w:fldCharType="begin"/>
-            </w:r>
-            <w:r>
-              <w:rPr>
-                <w:rFonts w:ascii="Arial" w:hAnsi="Arial"/>
-                <w:bCs/>
-                <w:color w:val="000000" w:themeColor="text1"/>
-                <w:sz w:val="16"/>
-                <w:szCs w:val="16"/>
-              </w:rPr>
-              <w:instrText xml:space="preserve"> MERGEFIELD  nom_transportista  \* MERGEFORMAT </w:instrText>
-            </w:r>
-            <w:r>
-              <w:rPr>
-                <w:rFonts w:ascii="Arial" w:hAnsi="Arial"/>
-                <w:bCs/>
-                <w:color w:val="000000" w:themeColor="text1"/>
-                <w:sz w:val="16"/>
-                <w:szCs w:val="16"/>
-              </w:rPr>
-              <w:fldChar w:fldCharType="separate"/>
-            </w:r>
-            <w:r>
-              <w:rPr>
-                <w:rFonts w:ascii="Arial" w:hAnsi="Arial"/>
-                <w:bCs/>
-                <w:noProof/>
-                <w:color w:val="000000" w:themeColor="text1"/>
-                <w:sz w:val="16"/>
-                <w:szCs w:val="16"/>
-              </w:rPr>
-              <w:t>«nom_transportista»</w:t>
-            </w:r>
-            <w:r>
-              <w:rPr>
-                <w:rFonts w:ascii="Arial" w:hAnsi="Arial"/>
-                <w:bCs/>
-                <w:color w:val="000000" w:themeColor="text1"/>
-                <w:sz w:val="16"/>
-                <w:szCs w:val="16"/>
-              </w:rPr>
-              <w:fldChar w:fldCharType="end"/>
             </w:r>
           </w:p>
         </w:tc>
       </w:tr>
       <w:tr>
         <w:trPr>
-          <w:trHeight w:val="557"/>
+          <w:trHeight w:val="375"/>
         </w:trPr>
         <w:tc>
           <w:tcPr>
-            <w:tcW w:w="1705" w:type="dxa"/>
-          </w:tcPr>
-          <w:p>
-            <w:pPr>
-              <w:rPr>
-                <w:rFonts w:ascii="Arial" w:hAnsi="Arial"/>
-                <w:bCs/>
-                <w:color w:val="000000" w:themeColor="text1"/>
-                <w:sz w:val="16"/>
-                <w:szCs w:val="16"/>
-              </w:rPr>
-            </w:pPr>
-            <w:proofErr w:type="spellStart"/>
-            <w:r>
+            <w:tcW w:w="1854" w:type="dxa"/>
+          </w:tcPr>
+          <w:p>
+            <w:pPr>
               <w:rPr>
                 <w:rFonts w:ascii="Arial" w:hAnsi="Arial"/>
                 <w:b/>
@@ -1967,9 +1268,7 @@
                 <w:szCs w:val="16"/>
                 <w:lang w:val="es-PE"/>
               </w:rPr>
-              <w:t>N°</w:t>
-            </w:r>
-            <w:proofErr w:type="spellEnd"/>
+            </w:pPr>
             <w:r>
               <w:rPr>
                 <w:rFonts w:ascii="Arial" w:hAnsi="Arial"/>
@@ -1979,13 +1278,13 @@
                 <w:szCs w:val="16"/>
                 <w:lang w:val="es-PE"/>
               </w:rPr>
-              <w:t xml:space="preserve"> Doc / Guia R.</w:t>
-            </w:r>
-          </w:p>
-        </w:tc>
-        <w:tc>
-          <w:tcPr>
-            <w:tcW w:w="3639" w:type="dxa"/>
+              <w:t>Teléfono</w:t>
+            </w:r>
+          </w:p>
+        </w:tc>
+        <w:tc>
+          <w:tcPr>
+            <w:tcW w:w="3955" w:type="dxa"/>
           </w:tcPr>
           <w:p>
             <w:pPr>
@@ -2015,7 +1314,28 @@
                 <w:sz w:val="16"/>
                 <w:szCs w:val="16"/>
               </w:rPr>
-              <w:instrText xml:space="preserve"> MERGEFIELD  guia_re  \* MERGEFORMAT </w:instrText>
+              <w:instrText xml:space="preserve"> MERGEFIELD  </w:instrText>
+            </w:r>
+            <w:r>
+              <w:rPr>
+                <w:rFonts w:ascii="Arial" w:hAnsi="Arial"/>
+                <w:bCs/>
+                <w:noProof/>
+                <w:color w:val="000000" w:themeColor="text1"/>
+                <w:sz w:val="16"/>
+                <w:szCs w:val="16"/>
+              </w:rPr>
+              <w:instrText>telefono_empresa</w:instrText>
+            </w:r>
+            <w:r>
+              <w:rPr>
+                <w:rFonts w:ascii="Arial" w:hAnsi="Arial"/>
+                <w:bCs/>
+                <w:color w:val="000000" w:themeColor="text1"/>
+                <w:sz w:val="16"/>
+                <w:szCs w:val="16"/>
+              </w:rPr>
+              <w:instrText xml:space="preserve">  \* MERGEFORMAT </w:instrText>
             </w:r>
             <w:r>
               <w:rPr>
@@ -2036,7 +1356,7 @@
                 <w:sz w:val="16"/>
                 <w:szCs w:val="16"/>
               </w:rPr>
-              <w:t>«guia_re»</w:t>
+              <w:t>«telefono_empresa»</w:t>
             </w:r>
             <w:r>
               <w:rPr>
@@ -2052,19 +1372,10 @@
         </w:tc>
         <w:tc>
           <w:tcPr>
-            <w:tcW w:w="2671" w:type="dxa"/>
-          </w:tcPr>
-          <w:p>
-            <w:pPr>
-              <w:rPr>
-                <w:rFonts w:ascii="Arial" w:hAnsi="Arial"/>
-                <w:bCs/>
-                <w:color w:val="000000" w:themeColor="text1"/>
-                <w:sz w:val="16"/>
-                <w:szCs w:val="16"/>
-              </w:rPr>
-            </w:pPr>
-            <w:r>
+            <w:tcW w:w="2903" w:type="dxa"/>
+          </w:tcPr>
+          <w:p>
+            <w:pPr>
               <w:rPr>
                 <w:rFonts w:ascii="Arial" w:hAnsi="Arial"/>
                 <w:b/>
@@ -2073,129 +1384,131 @@
                 <w:szCs w:val="16"/>
                 <w:lang w:val="es-PE"/>
               </w:rPr>
-              <w:t>Ruc</w:t>
-            </w:r>
-          </w:p>
-        </w:tc>
-        <w:tc>
-          <w:tcPr>
-            <w:tcW w:w="2671" w:type="dxa"/>
-          </w:tcPr>
-          <w:p>
-            <w:pPr>
-              <w:rPr>
-                <w:rFonts w:ascii="Arial" w:hAnsi="Arial"/>
-                <w:bCs/>
-                <w:color w:val="000000" w:themeColor="text1"/>
-                <w:sz w:val="16"/>
-                <w:szCs w:val="16"/>
-              </w:rPr>
-            </w:pPr>
-            <w:r>
-              <w:rPr>
-                <w:rFonts w:ascii="Arial" w:hAnsi="Arial"/>
-                <w:bCs/>
-                <w:color w:val="000000" w:themeColor="text1"/>
-                <w:sz w:val="16"/>
-                <w:szCs w:val="16"/>
-              </w:rPr>
-              <w:fldChar w:fldCharType="begin"/>
-            </w:r>
-            <w:r>
-              <w:rPr>
-                <w:rFonts w:ascii="Arial" w:hAnsi="Arial"/>
-                <w:bCs/>
-                <w:color w:val="000000" w:themeColor="text1"/>
-                <w:sz w:val="16"/>
-                <w:szCs w:val="16"/>
-              </w:rPr>
-              <w:instrText xml:space="preserve"> MERGEFIELD  ruc_trans  \* MERGEFORMAT </w:instrText>
-            </w:r>
-            <w:r>
-              <w:rPr>
-                <w:rFonts w:ascii="Arial" w:hAnsi="Arial"/>
-                <w:bCs/>
-                <w:color w:val="000000" w:themeColor="text1"/>
-                <w:sz w:val="16"/>
-                <w:szCs w:val="16"/>
-              </w:rPr>
-              <w:fldChar w:fldCharType="separate"/>
-            </w:r>
-            <w:r>
-              <w:rPr>
-                <w:rFonts w:ascii="Arial" w:hAnsi="Arial"/>
-                <w:bCs/>
-                <w:noProof/>
-                <w:color w:val="000000" w:themeColor="text1"/>
-                <w:sz w:val="16"/>
-                <w:szCs w:val="16"/>
-              </w:rPr>
-              <w:t>«ruc_trans»</w:t>
-            </w:r>
-            <w:r>
-              <w:rPr>
-                <w:rFonts w:ascii="Arial" w:hAnsi="Arial"/>
-                <w:bCs/>
-                <w:color w:val="000000" w:themeColor="text1"/>
-                <w:sz w:val="16"/>
-                <w:szCs w:val="16"/>
-              </w:rPr>
-              <w:fldChar w:fldCharType="end"/>
-            </w:r>
+            </w:pPr>
+          </w:p>
+        </w:tc>
+        <w:tc>
+          <w:tcPr>
+            <w:tcW w:w="2904" w:type="dxa"/>
+          </w:tcPr>
+          <w:p>
+            <w:pPr>
+              <w:rPr>
+                <w:rFonts w:ascii="Arial" w:hAnsi="Arial"/>
+                <w:bCs/>
+                <w:color w:val="000000" w:themeColor="text1"/>
+                <w:sz w:val="16"/>
+                <w:szCs w:val="16"/>
+              </w:rPr>
+            </w:pPr>
           </w:p>
         </w:tc>
       </w:tr>
       <w:tr>
         <w:trPr>
-          <w:trHeight w:val="378"/>
+          <w:trHeight w:val="201"/>
         </w:trPr>
         <w:tc>
           <w:tcPr>
-            <w:tcW w:w="1705" w:type="dxa"/>
-          </w:tcPr>
-          <w:p>
-            <w:pPr>
-              <w:rPr>
-                <w:rFonts w:ascii="Arial" w:hAnsi="Arial"/>
-                <w:b/>
-                <w:color w:val="000000" w:themeColor="text1"/>
-                <w:sz w:val="16"/>
-                <w:szCs w:val="16"/>
+            <w:tcW w:w="5809" w:type="dxa"/>
+            <w:gridSpan w:val="2"/>
+          </w:tcPr>
+          <w:p>
+            <w:pPr>
+              <w:rPr>
+                <w:rFonts w:ascii="Arial" w:hAnsi="Arial"/>
+                <w:bCs/>
+                <w:color w:val="000000" w:themeColor="text1"/>
+                <w:sz w:val="16"/>
+                <w:szCs w:val="16"/>
+              </w:rPr>
+            </w:pPr>
+            <w:r>
+              <w:rPr>
+                <w:rFonts w:ascii="Arial" w:hAnsi="Arial"/>
+                <w:b/>
+                <w:bCs/>
+                <w:color w:val="000000" w:themeColor="text1"/>
+                <w:sz w:val="16"/>
+                <w:szCs w:val="16"/>
+                <w:u w:val="single"/>
                 <w:lang w:val="es-PE"/>
               </w:rPr>
-            </w:pPr>
-          </w:p>
-        </w:tc>
-        <w:tc>
-          <w:tcPr>
-            <w:tcW w:w="3639" w:type="dxa"/>
-          </w:tcPr>
-          <w:p>
-            <w:pPr>
-              <w:rPr>
-                <w:rFonts w:ascii="Arial" w:hAnsi="Arial"/>
-                <w:bCs/>
-                <w:color w:val="000000" w:themeColor="text1"/>
-                <w:sz w:val="16"/>
-                <w:szCs w:val="16"/>
-              </w:rPr>
-            </w:pPr>
-          </w:p>
-        </w:tc>
-        <w:tc>
-          <w:tcPr>
-            <w:tcW w:w="2671" w:type="dxa"/>
-          </w:tcPr>
-          <w:p>
-            <w:pPr>
-              <w:rPr>
-                <w:rFonts w:ascii="Arial" w:hAnsi="Arial"/>
-                <w:b/>
-                <w:color w:val="000000" w:themeColor="text1"/>
-                <w:sz w:val="16"/>
-                <w:szCs w:val="16"/>
+              <w:t>Información</w:t>
+            </w:r>
+            <w:r>
+              <w:rPr>
+                <w:rFonts w:ascii="Arial" w:hAnsi="Arial"/>
+                <w:b/>
+                <w:bCs/>
+                <w:color w:val="000000" w:themeColor="text1"/>
+                <w:sz w:val="16"/>
+                <w:szCs w:val="16"/>
+                <w:u w:val="single"/>
                 <w:lang w:val="es-PE"/>
               </w:rPr>
+              <w:t xml:space="preserve"> Comercial</w:t>
+            </w:r>
+          </w:p>
+        </w:tc>
+        <w:tc>
+          <w:tcPr>
+            <w:tcW w:w="5808" w:type="dxa"/>
+            <w:gridSpan w:val="2"/>
+          </w:tcPr>
+          <w:p>
+            <w:pPr>
+              <w:rPr>
+                <w:rFonts w:ascii="Arial" w:hAnsi="Arial"/>
+                <w:b/>
+                <w:color w:val="000000" w:themeColor="text1"/>
+                <w:sz w:val="16"/>
+                <w:szCs w:val="16"/>
+                <w:u w:val="single"/>
+              </w:rPr>
+            </w:pPr>
+            <w:r>
+              <w:rPr>
+                <w:rFonts w:ascii="Arial" w:hAnsi="Arial"/>
+                <w:b/>
+                <w:color w:val="000000" w:themeColor="text1"/>
+                <w:sz w:val="16"/>
+                <w:szCs w:val="16"/>
+                <w:u w:val="single"/>
+              </w:rPr>
+              <w:t>Información</w:t>
+            </w:r>
+            <w:r>
+              <w:rPr>
+                <w:rFonts w:ascii="Arial" w:hAnsi="Arial"/>
+                <w:b/>
+                <w:color w:val="000000" w:themeColor="text1"/>
+                <w:sz w:val="16"/>
+                <w:szCs w:val="16"/>
+                <w:u w:val="single"/>
+              </w:rPr>
+              <w:t xml:space="preserve"> Transportista</w:t>
+            </w:r>
+          </w:p>
+        </w:tc>
+      </w:tr>
+      <w:tr>
+        <w:trPr>
+          <w:trHeight w:val="454"/>
+        </w:trPr>
+        <w:tc>
+          <w:tcPr>
+            <w:tcW w:w="1854" w:type="dxa"/>
+          </w:tcPr>
+          <w:p>
+            <w:pPr>
+              <w:rPr>
+                <w:rFonts w:ascii="Arial" w:hAnsi="Arial"/>
+                <w:bCs/>
+                <w:color w:val="000000" w:themeColor="text1"/>
+                <w:sz w:val="16"/>
+                <w:szCs w:val="16"/>
+              </w:rPr>
             </w:pPr>
             <w:r>
               <w:rPr>
@@ -2206,13 +1519,665 @@
                 <w:szCs w:val="16"/>
                 <w:lang w:val="es-PE"/>
               </w:rPr>
+              <w:t>P</w:t>
+            </w:r>
+            <w:r>
+              <w:rPr>
+                <w:rFonts w:ascii="Arial" w:hAnsi="Arial"/>
+                <w:b/>
+                <w:color w:val="000000" w:themeColor="text1"/>
+                <w:sz w:val="16"/>
+                <w:szCs w:val="16"/>
+                <w:lang w:val="es-PE"/>
+              </w:rPr>
+              <w:t>roveedor</w:t>
+            </w:r>
+          </w:p>
+        </w:tc>
+        <w:tc>
+          <w:tcPr>
+            <w:tcW w:w="3955" w:type="dxa"/>
+          </w:tcPr>
+          <w:p>
+            <w:pPr>
+              <w:rPr>
+                <w:rFonts w:ascii="Arial" w:hAnsi="Arial"/>
+                <w:bCs/>
+                <w:color w:val="000000" w:themeColor="text1"/>
+                <w:sz w:val="16"/>
+                <w:szCs w:val="16"/>
+              </w:rPr>
+            </w:pPr>
+            <w:r>
+              <w:rPr>
+                <w:rFonts w:ascii="Arial" w:hAnsi="Arial"/>
+                <w:bCs/>
+                <w:noProof/>
+                <w:color w:val="000000" w:themeColor="text1"/>
+                <w:sz w:val="16"/>
+                <w:szCs w:val="16"/>
+              </w:rPr>
+              <w:fldChar w:fldCharType="begin"/>
+            </w:r>
+            <w:r>
+              <w:rPr>
+                <w:rFonts w:ascii="Arial" w:hAnsi="Arial"/>
+                <w:bCs/>
+                <w:noProof/>
+                <w:color w:val="000000" w:themeColor="text1"/>
+                <w:sz w:val="16"/>
+                <w:szCs w:val="16"/>
+              </w:rPr>
+              <w:instrText xml:space="preserve"> MERGEFIELD  razon_social  \* MERGEFORMAT </w:instrText>
+            </w:r>
+            <w:r>
+              <w:rPr>
+                <w:rFonts w:ascii="Arial" w:hAnsi="Arial"/>
+                <w:bCs/>
+                <w:noProof/>
+                <w:color w:val="000000" w:themeColor="text1"/>
+                <w:sz w:val="16"/>
+                <w:szCs w:val="16"/>
+              </w:rPr>
+              <w:fldChar w:fldCharType="separate"/>
+            </w:r>
+            <w:r>
+              <w:rPr>
+                <w:rFonts w:ascii="Arial" w:hAnsi="Arial"/>
+                <w:bCs/>
+                <w:noProof/>
+                <w:color w:val="000000" w:themeColor="text1"/>
+                <w:sz w:val="16"/>
+                <w:szCs w:val="16"/>
+              </w:rPr>
+              <w:t>«razon_social»</w:t>
+            </w:r>
+            <w:r>
+              <w:rPr>
+                <w:rFonts w:ascii="Arial" w:hAnsi="Arial"/>
+                <w:bCs/>
+                <w:noProof/>
+                <w:color w:val="000000" w:themeColor="text1"/>
+                <w:sz w:val="16"/>
+                <w:szCs w:val="16"/>
+              </w:rPr>
+              <w:fldChar w:fldCharType="end"/>
+            </w:r>
+          </w:p>
+        </w:tc>
+        <w:tc>
+          <w:tcPr>
+            <w:tcW w:w="2903" w:type="dxa"/>
+          </w:tcPr>
+          <w:p>
+            <w:pPr>
+              <w:rPr>
+                <w:rFonts w:ascii="Arial" w:hAnsi="Arial"/>
+                <w:bCs/>
+                <w:color w:val="000000" w:themeColor="text1"/>
+                <w:sz w:val="16"/>
+                <w:szCs w:val="16"/>
+              </w:rPr>
+            </w:pPr>
+            <w:r>
+              <w:rPr>
+                <w:rFonts w:ascii="Arial" w:hAnsi="Arial"/>
+                <w:b/>
+                <w:color w:val="000000" w:themeColor="text1"/>
+                <w:sz w:val="16"/>
+                <w:szCs w:val="16"/>
+                <w:lang w:val="es-PE"/>
+              </w:rPr>
+              <w:t>Nombre(s)</w:t>
+            </w:r>
+          </w:p>
+        </w:tc>
+        <w:tc>
+          <w:tcPr>
+            <w:tcW w:w="2904" w:type="dxa"/>
+          </w:tcPr>
+          <w:p>
+            <w:pPr>
+              <w:rPr>
+                <w:rFonts w:ascii="Arial" w:hAnsi="Arial"/>
+                <w:bCs/>
+                <w:color w:val="000000" w:themeColor="text1"/>
+                <w:sz w:val="16"/>
+                <w:szCs w:val="16"/>
+              </w:rPr>
+            </w:pPr>
+            <w:r>
+              <w:rPr>
+                <w:rFonts w:ascii="Arial" w:hAnsi="Arial"/>
+                <w:bCs/>
+                <w:color w:val="000000" w:themeColor="text1"/>
+                <w:sz w:val="16"/>
+                <w:szCs w:val="16"/>
+              </w:rPr>
+              <w:fldChar w:fldCharType="begin"/>
+            </w:r>
+            <w:r>
+              <w:rPr>
+                <w:rFonts w:ascii="Arial" w:hAnsi="Arial"/>
+                <w:bCs/>
+                <w:color w:val="000000" w:themeColor="text1"/>
+                <w:sz w:val="16"/>
+                <w:szCs w:val="16"/>
+              </w:rPr>
+              <w:instrText xml:space="preserve"> MERGEFIELD  nom_conductor  \* MERGEFORMAT </w:instrText>
+            </w:r>
+            <w:r>
+              <w:rPr>
+                <w:rFonts w:ascii="Arial" w:hAnsi="Arial"/>
+                <w:bCs/>
+                <w:color w:val="000000" w:themeColor="text1"/>
+                <w:sz w:val="16"/>
+                <w:szCs w:val="16"/>
+              </w:rPr>
+              <w:fldChar w:fldCharType="separate"/>
+            </w:r>
+            <w:r>
+              <w:rPr>
+                <w:rFonts w:ascii="Arial" w:hAnsi="Arial"/>
+                <w:bCs/>
+                <w:noProof/>
+                <w:color w:val="000000" w:themeColor="text1"/>
+                <w:sz w:val="16"/>
+                <w:szCs w:val="16"/>
+              </w:rPr>
+              <w:t>«nom_conductor»</w:t>
+            </w:r>
+            <w:r>
+              <w:rPr>
+                <w:rFonts w:ascii="Arial" w:hAnsi="Arial"/>
+                <w:bCs/>
+                <w:color w:val="000000" w:themeColor="text1"/>
+                <w:sz w:val="16"/>
+                <w:szCs w:val="16"/>
+              </w:rPr>
+              <w:fldChar w:fldCharType="end"/>
+            </w:r>
+          </w:p>
+        </w:tc>
+      </w:tr>
+      <w:tr>
+        <w:trPr>
+          <w:trHeight w:val="434"/>
+        </w:trPr>
+        <w:tc>
+          <w:tcPr>
+            <w:tcW w:w="1854" w:type="dxa"/>
+          </w:tcPr>
+          <w:p>
+            <w:pPr>
+              <w:rPr>
+                <w:rFonts w:ascii="Arial" w:hAnsi="Arial"/>
+                <w:bCs/>
+                <w:color w:val="000000" w:themeColor="text1"/>
+                <w:sz w:val="16"/>
+                <w:szCs w:val="16"/>
+              </w:rPr>
+            </w:pPr>
+            <w:r>
+              <w:rPr>
+                <w:rFonts w:ascii="Arial" w:hAnsi="Arial"/>
+                <w:b/>
+                <w:color w:val="000000" w:themeColor="text1"/>
+                <w:sz w:val="16"/>
+                <w:szCs w:val="16"/>
+                <w:lang w:val="es-PE"/>
+              </w:rPr>
+              <w:t>RUC</w:t>
+            </w:r>
+            <w:r>
+              <w:rPr>
+                <w:rFonts w:ascii="Arial" w:hAnsi="Arial"/>
+                <w:b/>
+                <w:color w:val="000000" w:themeColor="text1"/>
+                <w:sz w:val="16"/>
+                <w:szCs w:val="16"/>
+                <w:lang w:val="es-PE"/>
+              </w:rPr>
+              <w:t xml:space="preserve"> </w:t>
+            </w:r>
+          </w:p>
+        </w:tc>
+        <w:tc>
+          <w:tcPr>
+            <w:tcW w:w="3955" w:type="dxa"/>
+          </w:tcPr>
+          <w:p>
+            <w:pPr>
+              <w:rPr>
+                <w:rFonts w:ascii="Arial" w:hAnsi="Arial"/>
+                <w:bCs/>
+                <w:color w:val="000000" w:themeColor="text1"/>
+                <w:sz w:val="16"/>
+                <w:szCs w:val="16"/>
+              </w:rPr>
+            </w:pPr>
+            <w:r>
+              <w:rPr>
+                <w:rFonts w:ascii="Arial" w:hAnsi="Arial"/>
+                <w:bCs/>
+                <w:color w:val="000000" w:themeColor="text1"/>
+                <w:sz w:val="16"/>
+                <w:szCs w:val="16"/>
+              </w:rPr>
+              <w:fldChar w:fldCharType="begin"/>
+            </w:r>
+            <w:r>
+              <w:rPr>
+                <w:rFonts w:ascii="Arial" w:hAnsi="Arial"/>
+                <w:bCs/>
+                <w:color w:val="000000" w:themeColor="text1"/>
+                <w:sz w:val="16"/>
+                <w:szCs w:val="16"/>
+              </w:rPr>
+              <w:instrText xml:space="preserve"> MERGEFIELD  nro_documento  \* MERGEFORMAT </w:instrText>
+            </w:r>
+            <w:r>
+              <w:rPr>
+                <w:rFonts w:ascii="Arial" w:hAnsi="Arial"/>
+                <w:bCs/>
+                <w:color w:val="000000" w:themeColor="text1"/>
+                <w:sz w:val="16"/>
+                <w:szCs w:val="16"/>
+              </w:rPr>
+              <w:fldChar w:fldCharType="separate"/>
+            </w:r>
+            <w:r>
+              <w:rPr>
+                <w:rFonts w:ascii="Arial" w:hAnsi="Arial"/>
+                <w:bCs/>
+                <w:noProof/>
+                <w:color w:val="000000" w:themeColor="text1"/>
+                <w:sz w:val="16"/>
+                <w:szCs w:val="16"/>
+              </w:rPr>
+              <w:t>«nro_documento»</w:t>
+            </w:r>
+            <w:r>
+              <w:rPr>
+                <w:rFonts w:ascii="Arial" w:hAnsi="Arial"/>
+                <w:bCs/>
+                <w:color w:val="000000" w:themeColor="text1"/>
+                <w:sz w:val="16"/>
+                <w:szCs w:val="16"/>
+              </w:rPr>
+              <w:fldChar w:fldCharType="end"/>
+            </w:r>
+          </w:p>
+        </w:tc>
+        <w:tc>
+          <w:tcPr>
+            <w:tcW w:w="2903" w:type="dxa"/>
+          </w:tcPr>
+          <w:p>
+            <w:pPr>
+              <w:rPr>
+                <w:rFonts w:ascii="Arial" w:hAnsi="Arial"/>
+                <w:bCs/>
+                <w:color w:val="000000" w:themeColor="text1"/>
+                <w:sz w:val="16"/>
+                <w:szCs w:val="16"/>
+              </w:rPr>
+            </w:pPr>
+            <w:r>
+              <w:rPr>
+                <w:rFonts w:ascii="Arial" w:hAnsi="Arial"/>
+                <w:b/>
+                <w:color w:val="000000" w:themeColor="text1"/>
+                <w:sz w:val="16"/>
+                <w:szCs w:val="16"/>
+                <w:lang w:val="es-PE"/>
+              </w:rPr>
+              <w:t>Empresa</w:t>
+            </w:r>
+          </w:p>
+        </w:tc>
+        <w:tc>
+          <w:tcPr>
+            <w:tcW w:w="2904" w:type="dxa"/>
+          </w:tcPr>
+          <w:p>
+            <w:pPr>
+              <w:rPr>
+                <w:rFonts w:ascii="Arial" w:hAnsi="Arial"/>
+                <w:bCs/>
+                <w:color w:val="000000" w:themeColor="text1"/>
+                <w:sz w:val="16"/>
+                <w:szCs w:val="16"/>
+              </w:rPr>
+            </w:pPr>
+            <w:r>
+              <w:rPr>
+                <w:rFonts w:ascii="Arial" w:hAnsi="Arial"/>
+                <w:bCs/>
+                <w:color w:val="000000" w:themeColor="text1"/>
+                <w:sz w:val="16"/>
+                <w:szCs w:val="16"/>
+              </w:rPr>
+              <w:fldChar w:fldCharType="begin"/>
+            </w:r>
+            <w:r>
+              <w:rPr>
+                <w:rFonts w:ascii="Arial" w:hAnsi="Arial"/>
+                <w:bCs/>
+                <w:color w:val="000000" w:themeColor="text1"/>
+                <w:sz w:val="16"/>
+                <w:szCs w:val="16"/>
+              </w:rPr>
+              <w:instrText xml:space="preserve"> MERGEFIELD  nom_transportista  \* MERGEFORMAT </w:instrText>
+            </w:r>
+            <w:r>
+              <w:rPr>
+                <w:rFonts w:ascii="Arial" w:hAnsi="Arial"/>
+                <w:bCs/>
+                <w:color w:val="000000" w:themeColor="text1"/>
+                <w:sz w:val="16"/>
+                <w:szCs w:val="16"/>
+              </w:rPr>
+              <w:fldChar w:fldCharType="separate"/>
+            </w:r>
+            <w:r>
+              <w:rPr>
+                <w:rFonts w:ascii="Arial" w:hAnsi="Arial"/>
+                <w:bCs/>
+                <w:noProof/>
+                <w:color w:val="000000" w:themeColor="text1"/>
+                <w:sz w:val="16"/>
+                <w:szCs w:val="16"/>
+              </w:rPr>
+              <w:t>«nom_transportista»</w:t>
+            </w:r>
+            <w:r>
+              <w:rPr>
+                <w:rFonts w:ascii="Arial" w:hAnsi="Arial"/>
+                <w:bCs/>
+                <w:color w:val="000000" w:themeColor="text1"/>
+                <w:sz w:val="16"/>
+                <w:szCs w:val="16"/>
+              </w:rPr>
+              <w:fldChar w:fldCharType="end"/>
+            </w:r>
+          </w:p>
+        </w:tc>
+      </w:tr>
+      <w:tr>
+        <w:trPr>
+          <w:trHeight w:val="390"/>
+        </w:trPr>
+        <w:tc>
+          <w:tcPr>
+            <w:tcW w:w="1854" w:type="dxa"/>
+          </w:tcPr>
+          <w:p>
+            <w:pPr>
+              <w:rPr>
+                <w:rFonts w:ascii="Arial" w:hAnsi="Arial"/>
+                <w:bCs/>
+                <w:color w:val="000000" w:themeColor="text1"/>
+                <w:sz w:val="16"/>
+                <w:szCs w:val="16"/>
+              </w:rPr>
+            </w:pPr>
+            <w:proofErr w:type="spellStart"/>
+            <w:r>
+              <w:rPr>
+                <w:rFonts w:ascii="Arial" w:hAnsi="Arial"/>
+                <w:b/>
+                <w:color w:val="000000" w:themeColor="text1"/>
+                <w:sz w:val="16"/>
+                <w:szCs w:val="16"/>
+                <w:lang w:val="es-PE"/>
+              </w:rPr>
+              <w:t>N°</w:t>
+            </w:r>
+            <w:proofErr w:type="spellEnd"/>
+            <w:r>
+              <w:rPr>
+                <w:rFonts w:ascii="Arial" w:hAnsi="Arial"/>
+                <w:b/>
+                <w:color w:val="000000" w:themeColor="text1"/>
+                <w:sz w:val="16"/>
+                <w:szCs w:val="16"/>
+                <w:lang w:val="es-PE"/>
+              </w:rPr>
+              <w:t xml:space="preserve"> Doc / Guia R.</w:t>
+            </w:r>
+          </w:p>
+        </w:tc>
+        <w:tc>
+          <w:tcPr>
+            <w:tcW w:w="3955" w:type="dxa"/>
+          </w:tcPr>
+          <w:p>
+            <w:pPr>
+              <w:rPr>
+                <w:rFonts w:ascii="Arial" w:hAnsi="Arial"/>
+                <w:bCs/>
+                <w:color w:val="000000" w:themeColor="text1"/>
+                <w:sz w:val="16"/>
+                <w:szCs w:val="16"/>
+              </w:rPr>
+            </w:pPr>
+            <w:r>
+              <w:rPr>
+                <w:rFonts w:ascii="Arial" w:hAnsi="Arial"/>
+                <w:bCs/>
+                <w:color w:val="000000" w:themeColor="text1"/>
+                <w:sz w:val="16"/>
+                <w:szCs w:val="16"/>
+              </w:rPr>
+              <w:fldChar w:fldCharType="begin"/>
+            </w:r>
+            <w:r>
+              <w:rPr>
+                <w:rFonts w:ascii="Arial" w:hAnsi="Arial"/>
+                <w:bCs/>
+                <w:color w:val="000000" w:themeColor="text1"/>
+                <w:sz w:val="16"/>
+                <w:szCs w:val="16"/>
+              </w:rPr>
+              <w:instrText xml:space="preserve"> MERGEFIELD  guia_re  \* MERGEFORMAT </w:instrText>
+            </w:r>
+            <w:r>
+              <w:rPr>
+                <w:rFonts w:ascii="Arial" w:hAnsi="Arial"/>
+                <w:bCs/>
+                <w:color w:val="000000" w:themeColor="text1"/>
+                <w:sz w:val="16"/>
+                <w:szCs w:val="16"/>
+              </w:rPr>
+              <w:fldChar w:fldCharType="separate"/>
+            </w:r>
+            <w:r>
+              <w:rPr>
+                <w:rFonts w:ascii="Arial" w:hAnsi="Arial"/>
+                <w:bCs/>
+                <w:noProof/>
+                <w:color w:val="000000" w:themeColor="text1"/>
+                <w:sz w:val="16"/>
+                <w:szCs w:val="16"/>
+              </w:rPr>
+              <w:t>«guia_re»</w:t>
+            </w:r>
+            <w:r>
+              <w:rPr>
+                <w:rFonts w:ascii="Arial" w:hAnsi="Arial"/>
+                <w:bCs/>
+                <w:color w:val="000000" w:themeColor="text1"/>
+                <w:sz w:val="16"/>
+                <w:szCs w:val="16"/>
+              </w:rPr>
+              <w:fldChar w:fldCharType="end"/>
+            </w:r>
+          </w:p>
+        </w:tc>
+        <w:tc>
+          <w:tcPr>
+            <w:tcW w:w="2903" w:type="dxa"/>
+          </w:tcPr>
+          <w:p>
+            <w:pPr>
+              <w:rPr>
+                <w:rFonts w:ascii="Arial" w:hAnsi="Arial"/>
+                <w:bCs/>
+                <w:color w:val="000000" w:themeColor="text1"/>
+                <w:sz w:val="16"/>
+                <w:szCs w:val="16"/>
+              </w:rPr>
+            </w:pPr>
+            <w:r>
+              <w:rPr>
+                <w:rFonts w:ascii="Arial" w:hAnsi="Arial"/>
+                <w:b/>
+                <w:color w:val="000000" w:themeColor="text1"/>
+                <w:sz w:val="16"/>
+                <w:szCs w:val="16"/>
+                <w:lang w:val="es-PE"/>
+              </w:rPr>
+              <w:t>Ruc</w:t>
+            </w:r>
+          </w:p>
+        </w:tc>
+        <w:tc>
+          <w:tcPr>
+            <w:tcW w:w="2904" w:type="dxa"/>
+          </w:tcPr>
+          <w:p>
+            <w:pPr>
+              <w:rPr>
+                <w:rFonts w:ascii="Arial" w:hAnsi="Arial"/>
+                <w:bCs/>
+                <w:color w:val="000000" w:themeColor="text1"/>
+                <w:sz w:val="16"/>
+                <w:szCs w:val="16"/>
+              </w:rPr>
+            </w:pPr>
+            <w:r>
+              <w:rPr>
+                <w:rFonts w:ascii="Arial" w:hAnsi="Arial"/>
+                <w:bCs/>
+                <w:color w:val="000000" w:themeColor="text1"/>
+                <w:sz w:val="16"/>
+                <w:szCs w:val="16"/>
+              </w:rPr>
+              <w:fldChar w:fldCharType="begin"/>
+            </w:r>
+            <w:r>
+              <w:rPr>
+                <w:rFonts w:ascii="Arial" w:hAnsi="Arial"/>
+                <w:bCs/>
+                <w:color w:val="000000" w:themeColor="text1"/>
+                <w:sz w:val="16"/>
+                <w:szCs w:val="16"/>
+              </w:rPr>
+              <w:instrText xml:space="preserve"> MERGEFIELD  ruc_trans  \* MERGEFORMAT </w:instrText>
+            </w:r>
+            <w:r>
+              <w:rPr>
+                <w:rFonts w:ascii="Arial" w:hAnsi="Arial"/>
+                <w:bCs/>
+                <w:color w:val="000000" w:themeColor="text1"/>
+                <w:sz w:val="16"/>
+                <w:szCs w:val="16"/>
+              </w:rPr>
+              <w:fldChar w:fldCharType="separate"/>
+            </w:r>
+            <w:r>
+              <w:rPr>
+                <w:rFonts w:ascii="Arial" w:hAnsi="Arial"/>
+                <w:bCs/>
+                <w:noProof/>
+                <w:color w:val="000000" w:themeColor="text1"/>
+                <w:sz w:val="16"/>
+                <w:szCs w:val="16"/>
+              </w:rPr>
+              <w:t>«ruc_trans»</w:t>
+            </w:r>
+            <w:r>
+              <w:rPr>
+                <w:rFonts w:ascii="Arial" w:hAnsi="Arial"/>
+                <w:bCs/>
+                <w:color w:val="000000" w:themeColor="text1"/>
+                <w:sz w:val="16"/>
+                <w:szCs w:val="16"/>
+              </w:rPr>
+              <w:fldChar w:fldCharType="end"/>
+            </w:r>
+          </w:p>
+        </w:tc>
+      </w:tr>
+      <w:tr>
+        <w:trPr>
+          <w:trHeight w:val="280"/>
+        </w:trPr>
+        <w:tc>
+          <w:tcPr>
+            <w:tcW w:w="1854" w:type="dxa"/>
+          </w:tcPr>
+          <w:p>
+            <w:pPr>
+              <w:rPr>
+                <w:rFonts w:ascii="Arial" w:hAnsi="Arial"/>
+                <w:b/>
+                <w:color w:val="000000" w:themeColor="text1"/>
+                <w:sz w:val="16"/>
+                <w:szCs w:val="16"/>
+                <w:lang w:val="es-PE"/>
+              </w:rPr>
+            </w:pPr>
+          </w:p>
+        </w:tc>
+        <w:tc>
+          <w:tcPr>
+            <w:tcW w:w="3955" w:type="dxa"/>
+          </w:tcPr>
+          <w:p>
+            <w:pPr>
+              <w:rPr>
+                <w:rFonts w:ascii="Arial" w:hAnsi="Arial"/>
+                <w:bCs/>
+                <w:color w:val="000000" w:themeColor="text1"/>
+                <w:sz w:val="16"/>
+                <w:szCs w:val="16"/>
+              </w:rPr>
+            </w:pPr>
+          </w:p>
+        </w:tc>
+        <w:tc>
+          <w:tcPr>
+            <w:tcW w:w="2903" w:type="dxa"/>
+          </w:tcPr>
+          <w:p>
+            <w:pPr>
+              <w:rPr>
+                <w:rFonts w:ascii="Arial" w:hAnsi="Arial"/>
+                <w:b/>
+                <w:color w:val="000000" w:themeColor="text1"/>
+                <w:sz w:val="16"/>
+                <w:szCs w:val="16"/>
+                <w:lang w:val="es-PE"/>
+              </w:rPr>
+            </w:pPr>
+            <w:r>
+              <w:rPr>
+                <w:rFonts w:ascii="Arial" w:hAnsi="Arial"/>
+                <w:b/>
+                <w:color w:val="000000" w:themeColor="text1"/>
+                <w:sz w:val="16"/>
+                <w:szCs w:val="16"/>
+                <w:lang w:val="es-PE"/>
+              </w:rPr>
               <w:t>Placa</w:t>
             </w:r>
           </w:p>
         </w:tc>
         <w:tc>
           <w:tcPr>
-            <w:tcW w:w="2671" w:type="dxa"/>
+            <w:tcW w:w="2904" w:type="dxa"/>
           </w:tcPr>
           <w:p>
             <w:pPr>
@@ -2289,26 +2254,10 @@
         </w:tc>
       </w:tr>
     </w:tbl>
-    <w:p>
-      <w:pPr>
-        <w:rPr>
-          <w:rFonts w:ascii="Arial" w:hAnsi="Arial"/>
-          <w:lang w:val="es-PE"/>
-        </w:rPr>
-      </w:pPr>
-    </w:p>
     <w:tbl>
       <w:tblPr>
-        <w:tblW w:w="10740" w:type="dxa"/>
+        <w:tblW w:w="11616" w:type="dxa"/>
         <w:tblInd w:w="-10" w:type="dxa"/>
-        <w:tblBorders>
-          <w:top w:val="single" w:sz="8" w:space="0" w:color="auto"/>
-          <w:left w:val="single" w:sz="8" w:space="0" w:color="auto"/>
-          <w:bottom w:val="single" w:sz="8" w:space="0" w:color="auto"/>
-          <w:right w:val="single" w:sz="8" w:space="0" w:color="auto"/>
-          <w:insideH w:val="single" w:sz="8" w:space="0" w:color="auto"/>
-          <w:insideV w:val="single" w:sz="8" w:space="0" w:color="auto"/>
-        </w:tblBorders>
         <w:shd w:val="clear" w:color="auto" w:fill="538135" w:themeFill="accent6" w:themeFillShade="BF"/>
         <w:tblLayout w:type="fixed"/>
         <w:tblCellMar>
@@ -2318,25 +2267,19 @@
         <w:tblLook w:val="0000" w:firstRow="0" w:lastRow="0" w:firstColumn="0" w:lastColumn="0" w:noHBand="0" w:noVBand="0"/>
       </w:tblPr>
       <w:tblGrid>
-        <w:gridCol w:w="3129"/>
-        <w:gridCol w:w="2551"/>
-        <w:gridCol w:w="993"/>
-        <w:gridCol w:w="1134"/>
-        <w:gridCol w:w="2933"/>
+        <w:gridCol w:w="3385"/>
+        <w:gridCol w:w="2432"/>
+        <w:gridCol w:w="1401"/>
+        <w:gridCol w:w="1434"/>
+        <w:gridCol w:w="2964"/>
       </w:tblGrid>
       <w:tr>
         <w:trPr>
-          <w:trHeight w:val="344"/>
+          <w:trHeight w:val="444"/>
         </w:trPr>
         <w:tc>
           <w:tcPr>
-            <w:tcW w:w="3129" w:type="dxa"/>
-            <w:tcBorders>
-              <w:top w:val="single" w:sz="4" w:space="0" w:color="auto"/>
-              <w:left w:val="nil"/>
-              <w:bottom w:val="single" w:sz="4" w:space="0" w:color="auto"/>
-              <w:right w:val="nil"/>
-            </w:tcBorders>
+            <w:tcW w:w="3385" w:type="dxa"/>
             <w:vAlign w:val="center"/>
           </w:tcPr>
           <w:p>
@@ -2368,13 +2311,7 @@
         </w:tc>
         <w:tc>
           <w:tcPr>
-            <w:tcW w:w="2551" w:type="dxa"/>
-            <w:tcBorders>
-              <w:top w:val="single" w:sz="4" w:space="0" w:color="auto"/>
-              <w:left w:val="nil"/>
-              <w:bottom w:val="single" w:sz="4" w:space="0" w:color="auto"/>
-              <w:right w:val="nil"/>
-            </w:tcBorders>
+            <w:tcW w:w="2432" w:type="dxa"/>
             <w:vAlign w:val="center"/>
           </w:tcPr>
           <w:p>
@@ -2406,13 +2343,7 @@
         </w:tc>
         <w:tc>
           <w:tcPr>
-            <w:tcW w:w="993" w:type="dxa"/>
-            <w:tcBorders>
-              <w:top w:val="single" w:sz="4" w:space="0" w:color="auto"/>
-              <w:left w:val="nil"/>
-              <w:bottom w:val="single" w:sz="4" w:space="0" w:color="auto"/>
-              <w:right w:val="nil"/>
-            </w:tcBorders>
+            <w:tcW w:w="1401" w:type="dxa"/>
             <w:vAlign w:val="center"/>
           </w:tcPr>
           <w:p>
@@ -2444,13 +2375,7 @@
         </w:tc>
         <w:tc>
           <w:tcPr>
-            <w:tcW w:w="1134" w:type="dxa"/>
-            <w:tcBorders>
-              <w:top w:val="single" w:sz="4" w:space="0" w:color="auto"/>
-              <w:left w:val="nil"/>
-              <w:bottom w:val="single" w:sz="4" w:space="0" w:color="auto"/>
-              <w:right w:val="nil"/>
-            </w:tcBorders>
+            <w:tcW w:w="1434" w:type="dxa"/>
             <w:vAlign w:val="center"/>
           </w:tcPr>
           <w:p>
@@ -2482,13 +2407,7 @@
         </w:tc>
         <w:tc>
           <w:tcPr>
-            <w:tcW w:w="2933" w:type="dxa"/>
-            <w:tcBorders>
-              <w:top w:val="single" w:sz="4" w:space="0" w:color="auto"/>
-              <w:left w:val="nil"/>
-              <w:bottom w:val="single" w:sz="4" w:space="0" w:color="auto"/>
-              <w:right w:val="nil"/>
-            </w:tcBorders>
+            <w:tcW w:w="2964" w:type="dxa"/>
             <w:vAlign w:val="center"/>
           </w:tcPr>
           <w:p>
@@ -2519,17 +2438,11 @@
       </w:tr>
       <w:tr>
         <w:trPr>
-          <w:trHeight w:val="344"/>
+          <w:trHeight w:val="444"/>
         </w:trPr>
         <w:tc>
           <w:tcPr>
-            <w:tcW w:w="3129" w:type="dxa"/>
-            <w:tcBorders>
-              <w:top w:val="single" w:sz="4" w:space="0" w:color="auto"/>
-              <w:left w:val="nil"/>
-              <w:bottom w:val="nil"/>
-              <w:right w:val="nil"/>
-            </w:tcBorders>
+            <w:tcW w:w="3385" w:type="dxa"/>
             <w:vAlign w:val="center"/>
           </w:tcPr>
           <w:p>
@@ -2619,13 +2532,7 @@
         </w:tc>
         <w:tc>
           <w:tcPr>
-            <w:tcW w:w="2551" w:type="dxa"/>
-            <w:tcBorders>
-              <w:top w:val="single" w:sz="4" w:space="0" w:color="auto"/>
-              <w:left w:val="nil"/>
-              <w:bottom w:val="nil"/>
-              <w:right w:val="nil"/>
-            </w:tcBorders>
+            <w:tcW w:w="2432" w:type="dxa"/>
             <w:vAlign w:val="center"/>
           </w:tcPr>
           <w:p>
@@ -2715,13 +2622,7 @@
         </w:tc>
         <w:tc>
           <w:tcPr>
-            <w:tcW w:w="993" w:type="dxa"/>
-            <w:tcBorders>
-              <w:top w:val="single" w:sz="4" w:space="0" w:color="auto"/>
-              <w:left w:val="nil"/>
-              <w:bottom w:val="nil"/>
-              <w:right w:val="nil"/>
-            </w:tcBorders>
+            <w:tcW w:w="1401" w:type="dxa"/>
             <w:vAlign w:val="center"/>
           </w:tcPr>
           <w:p>
@@ -2811,13 +2712,7 @@
         </w:tc>
         <w:tc>
           <w:tcPr>
-            <w:tcW w:w="1134" w:type="dxa"/>
-            <w:tcBorders>
-              <w:top w:val="single" w:sz="4" w:space="0" w:color="auto"/>
-              <w:left w:val="nil"/>
-              <w:bottom w:val="nil"/>
-              <w:right w:val="nil"/>
-            </w:tcBorders>
+            <w:tcW w:w="1434" w:type="dxa"/>
             <w:vAlign w:val="center"/>
           </w:tcPr>
           <w:p>
@@ -2907,13 +2802,7 @@
         </w:tc>
         <w:tc>
           <w:tcPr>
-            <w:tcW w:w="2933" w:type="dxa"/>
-            <w:tcBorders>
-              <w:top w:val="single" w:sz="4" w:space="0" w:color="auto"/>
-              <w:left w:val="nil"/>
-              <w:bottom w:val="nil"/>
-              <w:right w:val="nil"/>
-            </w:tcBorders>
+            <w:tcW w:w="2964" w:type="dxa"/>
             <w:vAlign w:val="center"/>
           </w:tcPr>
           <w:p>
@@ -3045,19 +2934,19 @@
         <w:tblDescription w:val="Tabla de diseño de encabezado"/>
       </w:tblPr>
       <w:tblGrid>
-        <w:gridCol w:w="1706"/>
-        <w:gridCol w:w="1276"/>
-        <w:gridCol w:w="2410"/>
-        <w:gridCol w:w="2168"/>
-        <w:gridCol w:w="3140"/>
+        <w:gridCol w:w="1702"/>
+        <w:gridCol w:w="1412"/>
+        <w:gridCol w:w="2266"/>
+        <w:gridCol w:w="2163"/>
+        <w:gridCol w:w="3133"/>
       </w:tblGrid>
       <w:tr>
         <w:trPr>
-          <w:trHeight w:val="397"/>
+          <w:trHeight w:val="188"/>
         </w:trPr>
         <w:tc>
           <w:tcPr>
-            <w:tcW w:w="1706" w:type="dxa"/>
+            <w:tcW w:w="1705" w:type="dxa"/>
           </w:tcPr>
           <w:p>
             <w:pPr>
@@ -3085,23 +2974,23 @@
         </w:tc>
         <w:tc>
           <w:tcPr>
-            <w:tcW w:w="1276" w:type="dxa"/>
-          </w:tcPr>
-          <w:p>
-            <w:pPr>
-              <w:rPr>
-                <w:rFonts w:ascii="Arial" w:hAnsi="Arial"/>
-                <w:bCs/>
-                <w:color w:val="000000" w:themeColor="text1"/>
-                <w:sz w:val="16"/>
-                <w:szCs w:val="16"/>
-              </w:rPr>
-            </w:pPr>
-          </w:p>
-        </w:tc>
-        <w:tc>
-          <w:tcPr>
-            <w:tcW w:w="2410" w:type="dxa"/>
+            <w:tcW w:w="1414" w:type="dxa"/>
+          </w:tcPr>
+          <w:p>
+            <w:pPr>
+              <w:rPr>
+                <w:rFonts w:ascii="Arial" w:hAnsi="Arial"/>
+                <w:bCs/>
+                <w:color w:val="000000" w:themeColor="text1"/>
+                <w:sz w:val="16"/>
+                <w:szCs w:val="16"/>
+              </w:rPr>
+            </w:pPr>
+          </w:p>
+        </w:tc>
+        <w:tc>
+          <w:tcPr>
+            <w:tcW w:w="2270" w:type="dxa"/>
           </w:tcPr>
           <w:p>
             <w:pPr>
@@ -3118,7 +3007,7 @@
         </w:tc>
         <w:tc>
           <w:tcPr>
-            <w:tcW w:w="2168" w:type="dxa"/>
+            <w:tcW w:w="2167" w:type="dxa"/>
           </w:tcPr>
           <w:p>
             <w:pPr>
@@ -3146,7 +3035,7 @@
         </w:tc>
         <w:tc>
           <w:tcPr>
-            <w:tcW w:w="3140" w:type="dxa"/>
+            <w:tcW w:w="3138" w:type="dxa"/>
           </w:tcPr>
           <w:p>
             <w:pPr>
@@ -3218,11 +3107,11 @@
       </w:tr>
       <w:tr>
         <w:trPr>
-          <w:trHeight w:val="397"/>
+          <w:trHeight w:val="438"/>
         </w:trPr>
         <w:tc>
           <w:tcPr>
-            <w:tcW w:w="1706" w:type="dxa"/>
+            <w:tcW w:w="1705" w:type="dxa"/>
           </w:tcPr>
           <w:p>
             <w:pPr>
@@ -3249,7 +3138,7 @@
         </w:tc>
         <w:tc>
           <w:tcPr>
-            <w:tcW w:w="1276" w:type="dxa"/>
+            <w:tcW w:w="1414" w:type="dxa"/>
           </w:tcPr>
           <w:p>
             <w:pPr>
@@ -3326,7 +3215,7 @@
         </w:tc>
         <w:tc>
           <w:tcPr>
-            <w:tcW w:w="2410" w:type="dxa"/>
+            <w:tcW w:w="2270" w:type="dxa"/>
           </w:tcPr>
           <w:p>
             <w:pPr>
@@ -3404,7 +3293,7 @@
         </w:tc>
         <w:tc>
           <w:tcPr>
-            <w:tcW w:w="2168" w:type="dxa"/>
+            <w:tcW w:w="2167" w:type="dxa"/>
           </w:tcPr>
           <w:p>
             <w:pPr>
@@ -3431,7 +3320,7 @@
         </w:tc>
         <w:tc>
           <w:tcPr>
-            <w:tcW w:w="3140" w:type="dxa"/>
+            <w:tcW w:w="3138" w:type="dxa"/>
           </w:tcPr>
           <w:p>
             <w:pPr>
@@ -3499,11 +3388,11 @@
       </w:tr>
       <w:tr>
         <w:trPr>
-          <w:trHeight w:val="397"/>
+          <w:trHeight w:val="274"/>
         </w:trPr>
         <w:tc>
           <w:tcPr>
-            <w:tcW w:w="1706" w:type="dxa"/>
+            <w:tcW w:w="1705" w:type="dxa"/>
           </w:tcPr>
           <w:p>
             <w:pPr>
@@ -3530,7 +3419,7 @@
         </w:tc>
         <w:tc>
           <w:tcPr>
-            <w:tcW w:w="1276" w:type="dxa"/>
+            <w:tcW w:w="1414" w:type="dxa"/>
           </w:tcPr>
           <w:p>
             <w:pPr>
@@ -3607,7 +3496,7 @@
         </w:tc>
         <w:tc>
           <w:tcPr>
-            <w:tcW w:w="2410" w:type="dxa"/>
+            <w:tcW w:w="2270" w:type="dxa"/>
           </w:tcPr>
           <w:p>
             <w:pPr>
@@ -3684,23 +3573,23 @@
         </w:tc>
         <w:tc>
           <w:tcPr>
-            <w:tcW w:w="2168" w:type="dxa"/>
-          </w:tcPr>
-          <w:p>
-            <w:pPr>
-              <w:rPr>
-                <w:rFonts w:ascii="Arial" w:hAnsi="Arial"/>
-                <w:bCs/>
-                <w:color w:val="000000" w:themeColor="text1"/>
-                <w:sz w:val="16"/>
-                <w:szCs w:val="16"/>
-              </w:rPr>
-            </w:pPr>
-          </w:p>
-        </w:tc>
-        <w:tc>
-          <w:tcPr>
-            <w:tcW w:w="3140" w:type="dxa"/>
+            <w:tcW w:w="2167" w:type="dxa"/>
+          </w:tcPr>
+          <w:p>
+            <w:pPr>
+              <w:rPr>
+                <w:rFonts w:ascii="Arial" w:hAnsi="Arial"/>
+                <w:bCs/>
+                <w:color w:val="000000" w:themeColor="text1"/>
+                <w:sz w:val="16"/>
+                <w:szCs w:val="16"/>
+              </w:rPr>
+            </w:pPr>
+          </w:p>
+        </w:tc>
+        <w:tc>
+          <w:tcPr>
+            <w:tcW w:w="3138" w:type="dxa"/>
           </w:tcPr>
           <w:p>
             <w:pPr>
@@ -3717,11 +3606,11 @@
       </w:tr>
       <w:tr>
         <w:trPr>
-          <w:trHeight w:val="397"/>
+          <w:trHeight w:val="294"/>
         </w:trPr>
         <w:tc>
           <w:tcPr>
-            <w:tcW w:w="1706" w:type="dxa"/>
+            <w:tcW w:w="1705" w:type="dxa"/>
           </w:tcPr>
           <w:p>
             <w:pPr>
@@ -3748,7 +3637,7 @@
         </w:tc>
         <w:tc>
           <w:tcPr>
-            <w:tcW w:w="1276" w:type="dxa"/>
+            <w:tcW w:w="1414" w:type="dxa"/>
           </w:tcPr>
           <w:p>
             <w:pPr>
@@ -3825,7 +3714,7 @@
         </w:tc>
         <w:tc>
           <w:tcPr>
-            <w:tcW w:w="2410" w:type="dxa"/>
+            <w:tcW w:w="2270" w:type="dxa"/>
           </w:tcPr>
           <w:p>
             <w:pPr>
@@ -3842,7 +3731,7 @@
         </w:tc>
         <w:tc>
           <w:tcPr>
-            <w:tcW w:w="2168" w:type="dxa"/>
+            <w:tcW w:w="2167" w:type="dxa"/>
           </w:tcPr>
           <w:p>
             <w:pPr>
@@ -3869,7 +3758,7 @@
         </w:tc>
         <w:tc>
           <w:tcPr>
-            <w:tcW w:w="3140" w:type="dxa"/>
+            <w:tcW w:w="3138" w:type="dxa"/>
           </w:tcPr>
           <w:p>
             <w:pPr>
@@ -3961,34 +3850,12 @@
         <w:t>Final del formulario</w:t>
       </w:r>
     </w:p>
-    <w:p>
-      <w:pPr>
-        <w:rPr>
-          <w:lang w:val="es-PE"/>
-        </w:rPr>
-      </w:pPr>
-    </w:p>
-    <w:p>
-      <w:pPr>
-        <w:tabs>
-          <w:tab w:val="left" w:pos="7325"/>
-        </w:tabs>
-        <w:rPr>
-          <w:lang w:val="es-PE"/>
-        </w:rPr>
-      </w:pPr>
-    </w:p>
     <w:sectPr>
-      <w:headerReference w:type="even" r:id="rId7"/>
-      <w:headerReference w:type="default" r:id="rId8"/>
-      <w:footerReference w:type="even" r:id="rId9"/>
-      <w:footerReference w:type="default" r:id="rId10"/>
-      <w:headerReference w:type="first" r:id="rId11"/>
-      <w:footerReference w:type="first" r:id="rId12"/>
-      <w:pgSz w:w="11900" w:h="16836"/>
-      <w:pgMar w:top="142" w:right="644" w:bottom="851" w:left="560" w:header="0" w:footer="0" w:gutter="0"/>
+      <w:footerReference w:type="default" r:id="rId7"/>
+      <w:pgSz w:w="11906" w:h="8391" w:orient="landscape" w:code="11"/>
+      <w:pgMar w:top="-185" w:right="851" w:bottom="284" w:left="170" w:header="0" w:footer="0" w:gutter="0"/>
       <w:cols w:space="0" w:equalWidth="0">
-        <w:col w:w="10700"/>
+        <w:col w:w="10672"/>
       </w:cols>
       <w:docGrid w:linePitch="360"/>
     </w:sectPr>
@@ -4016,16 +3883,6 @@
 </file>
 
 <file path=word/footer1.xml><?xml version="1.0" encoding="utf-8"?>
-<w:ftr xmlns:wpc="http://schemas.microsoft.com/office/word/2010/wordprocessingCanvas" xmlns:cx="http://schemas.microsoft.com/office/drawing/2014/chartex" xmlns:cx1="http://schemas.microsoft.com/office/drawing/2015/9/8/chartex" xmlns:cx2="http://schemas.microsoft.com/office/drawing/2015/10/21/chartex" xmlns:cx3="http://schemas.microsoft.com/office/drawing/2016/5/9/chartex" xmlns:cx4="http://schemas.microsoft.com/office/drawing/2016/5/10/chartex" xmlns:cx5="http://schemas.microsoft.com/office/drawing/2016/5/11/chartex" xmlns:cx6="http://schemas.microsoft.com/office/drawing/2016/5/12/chartex" xmlns:cx7="http://schemas.microsoft.com/office/drawing/2016/5/13/chartex" xmlns:cx8="http://schemas.microsoft.com/office/drawing/2016/5/14/chartex" xmlns:mc="http://schemas.openxmlformats.org/markup-compatibility/2006" xmlns:aink="http://schemas.microsoft.com/office/drawing/2016/ink" xmlns:am3d="http://schemas.microsoft.com/office/drawing/2017/model3d" xmlns:o="urn:schemas-microsoft-com:office:office" xmlns:oel="http://schemas.microsoft.com/office/2019/extlst" xmlns:r="http://schemas.openxmlformats.org/officeDocument/2006/relationships" xmlns:m="http://schemas.openxmlformats.org/officeDocument/2006/math" xmlns:v="urn:schemas-microsoft-com:vml" xmlns:wp14="http://schemas.microsoft.com/office/word/2010/wordprocessingDrawing" xmlns:wp="http://schemas.openxmlformats.org/drawingml/2006/wordprocessingDrawing" xmlns:w10="urn:schemas-microsoft-com:office:word" xmlns:w="http://schemas.openxmlformats.org/wordprocessingml/2006/main" xmlns:w14="http://schemas.microsoft.com/office/word/2010/wordml" xmlns:w15="http://schemas.microsoft.com/office/word/2012/wordml" xmlns:w16cex="http://schemas.microsoft.com/office/word/2018/wordml/cex" xmlns:w16cid="http://schemas.microsoft.com/office/word/2016/wordml/cid" xmlns:w16="http://schemas.microsoft.com/office/word/2018/wordml" xmlns:w16du="http://schemas.microsoft.com/office/word/2023/wordml/word16du" xmlns:w16sdtdh="http://schemas.microsoft.com/office/word/2020/wordml/sdtdatahash" xmlns:w16sdtfl="http://schemas.microsoft.com/office/word/2024/wordml/sdtformatlock" xmlns:w16se="http://schemas.microsoft.com/office/word/2015/wordml/symex" xmlns:wpg="http://schemas.microsoft.com/office/word/2010/wordprocessingGroup" xmlns:wpi="http://schemas.microsoft.com/office/word/2010/wordprocessingInk" xmlns:wne="http://schemas.microsoft.com/office/word/2006/wordml" xmlns:wps="http://schemas.microsoft.com/office/word/2010/wordprocessingShape" mc:Ignorable="w14 w15 w16se w16cid w16 w16cex w16sdtdh w16sdtfl w16du wp14">
-  <w:p>
-    <w:pPr>
-      <w:pStyle w:val="Piedepgina"/>
-    </w:pPr>
-  </w:p>
-</w:ftr>
-</file>
-
-<file path=word/footer2.xml><?xml version="1.0" encoding="utf-8"?>
 <w:ftr xmlns:wpc="http://schemas.microsoft.com/office/word/2010/wordprocessingCanvas" xmlns:cx="http://schemas.microsoft.com/office/drawing/2014/chartex" xmlns:cx1="http://schemas.microsoft.com/office/drawing/2015/9/8/chartex" xmlns:cx2="http://schemas.microsoft.com/office/drawing/2015/10/21/chartex" xmlns:cx3="http://schemas.microsoft.com/office/drawing/2016/5/9/chartex" xmlns:cx4="http://schemas.microsoft.com/office/drawing/2016/5/10/chartex" xmlns:cx5="http://schemas.microsoft.com/office/drawing/2016/5/11/chartex" xmlns:cx6="http://schemas.microsoft.com/office/drawing/2016/5/12/chartex" xmlns:cx7="http://schemas.microsoft.com/office/drawing/2016/5/13/chartex" xmlns:cx8="http://schemas.microsoft.com/office/drawing/2016/5/14/chartex" xmlns:mc="http://schemas.openxmlformats.org/markup-compatibility/2006" xmlns:aink="http://schemas.microsoft.com/office/drawing/2016/ink" xmlns:am3d="http://schemas.microsoft.com/office/drawing/2017/model3d" xmlns:o="urn:schemas-microsoft-com:office:office" xmlns:oel="http://schemas.microsoft.com/office/2019/extlst" xmlns:r="http://schemas.openxmlformats.org/officeDocument/2006/relationships" xmlns:m="http://schemas.openxmlformats.org/officeDocument/2006/math" xmlns:v="urn:schemas-microsoft-com:vml" xmlns:wp14="http://schemas.microsoft.com/office/word/2010/wordprocessingDrawing" xmlns:wp="http://schemas.openxmlformats.org/drawingml/2006/wordprocessingDrawing" xmlns:w10="urn:schemas-microsoft-com:office:word" xmlns:w="http://schemas.openxmlformats.org/wordprocessingml/2006/main" xmlns:w14="http://schemas.microsoft.com/office/word/2010/wordml" xmlns:w15="http://schemas.microsoft.com/office/word/2012/wordml" xmlns:w16cex="http://schemas.microsoft.com/office/word/2018/wordml/cex" xmlns:w16cid="http://schemas.microsoft.com/office/word/2016/wordml/cid" xmlns:w16="http://schemas.microsoft.com/office/word/2018/wordml" xmlns:w16du="http://schemas.microsoft.com/office/word/2023/wordml/word16du" xmlns:w16sdtdh="http://schemas.microsoft.com/office/word/2020/wordml/sdtdatahash" xmlns:w16sdtfl="http://schemas.microsoft.com/office/word/2024/wordml/sdtformatlock" xmlns:w16se="http://schemas.microsoft.com/office/word/2015/wordml/symex" xmlns:wpg="http://schemas.microsoft.com/office/word/2010/wordprocessingGroup" xmlns:wpi="http://schemas.microsoft.com/office/word/2010/wordprocessingInk" xmlns:wne="http://schemas.microsoft.com/office/word/2006/wordml" xmlns:wps="http://schemas.microsoft.com/office/word/2010/wordprocessingShape" mc:Ignorable="w14 w15 w16se w16cid w16 w16cex w16sdtdh w16sdtfl w16du wp14">
   <w:p>
     <w:pPr>
@@ -4323,16 +4180,6 @@
 </w:ftr>
 </file>
 
-<file path=word/footer3.xml><?xml version="1.0" encoding="utf-8"?>
-<w:ftr xmlns:wpc="http://schemas.microsoft.com/office/word/2010/wordprocessingCanvas" xmlns:cx="http://schemas.microsoft.com/office/drawing/2014/chartex" xmlns:cx1="http://schemas.microsoft.com/office/drawing/2015/9/8/chartex" xmlns:cx2="http://schemas.microsoft.com/office/drawing/2015/10/21/chartex" xmlns:cx3="http://schemas.microsoft.com/office/drawing/2016/5/9/chartex" xmlns:cx4="http://schemas.microsoft.com/office/drawing/2016/5/10/chartex" xmlns:cx5="http://schemas.microsoft.com/office/drawing/2016/5/11/chartex" xmlns:cx6="http://schemas.microsoft.com/office/drawing/2016/5/12/chartex" xmlns:cx7="http://schemas.microsoft.com/office/drawing/2016/5/13/chartex" xmlns:cx8="http://schemas.microsoft.com/office/drawing/2016/5/14/chartex" xmlns:mc="http://schemas.openxmlformats.org/markup-compatibility/2006" xmlns:aink="http://schemas.microsoft.com/office/drawing/2016/ink" xmlns:am3d="http://schemas.microsoft.com/office/drawing/2017/model3d" xmlns:o="urn:schemas-microsoft-com:office:office" xmlns:oel="http://schemas.microsoft.com/office/2019/extlst" xmlns:r="http://schemas.openxmlformats.org/officeDocument/2006/relationships" xmlns:m="http://schemas.openxmlformats.org/officeDocument/2006/math" xmlns:v="urn:schemas-microsoft-com:vml" xmlns:wp14="http://schemas.microsoft.com/office/word/2010/wordprocessingDrawing" xmlns:wp="http://schemas.openxmlformats.org/drawingml/2006/wordprocessingDrawing" xmlns:w10="urn:schemas-microsoft-com:office:word" xmlns:w="http://schemas.openxmlformats.org/wordprocessingml/2006/main" xmlns:w14="http://schemas.microsoft.com/office/word/2010/wordml" xmlns:w15="http://schemas.microsoft.com/office/word/2012/wordml" xmlns:w16cex="http://schemas.microsoft.com/office/word/2018/wordml/cex" xmlns:w16cid="http://schemas.microsoft.com/office/word/2016/wordml/cid" xmlns:w16="http://schemas.microsoft.com/office/word/2018/wordml" xmlns:w16du="http://schemas.microsoft.com/office/word/2023/wordml/word16du" xmlns:w16sdtdh="http://schemas.microsoft.com/office/word/2020/wordml/sdtdatahash" xmlns:w16sdtfl="http://schemas.microsoft.com/office/word/2024/wordml/sdtformatlock" xmlns:w16se="http://schemas.microsoft.com/office/word/2015/wordml/symex" xmlns:wpg="http://schemas.microsoft.com/office/word/2010/wordprocessingGroup" xmlns:wpi="http://schemas.microsoft.com/office/word/2010/wordprocessingInk" xmlns:wne="http://schemas.microsoft.com/office/word/2006/wordml" xmlns:wps="http://schemas.microsoft.com/office/word/2010/wordprocessingShape" mc:Ignorable="w14 w15 w16se w16cid w16 w16cex w16sdtdh w16sdtfl w16du wp14">
-  <w:p>
-    <w:pPr>
-      <w:pStyle w:val="Piedepgina"/>
-    </w:pPr>
-  </w:p>
-</w:ftr>
-</file>
-
 <file path=word/footnotes.xml><?xml version="1.0" encoding="utf-8"?>
 <w:footnotes xmlns:wpc="http://schemas.microsoft.com/office/word/2010/wordprocessingCanvas" xmlns:cx="http://schemas.microsoft.com/office/drawing/2014/chartex" xmlns:cx1="http://schemas.microsoft.com/office/drawing/2015/9/8/chartex" xmlns:cx2="http://schemas.microsoft.com/office/drawing/2015/10/21/chartex" xmlns:cx3="http://schemas.microsoft.com/office/drawing/2016/5/9/chartex" xmlns:cx4="http://schemas.microsoft.com/office/drawing/2016/5/10/chartex" xmlns:cx5="http://schemas.microsoft.com/office/drawing/2016/5/11/chartex" xmlns:cx6="http://schemas.microsoft.com/office/drawing/2016/5/12/chartex" xmlns:cx7="http://schemas.microsoft.com/office/drawing/2016/5/13/chartex" xmlns:cx8="http://schemas.microsoft.com/office/drawing/2016/5/14/chartex" xmlns:mc="http://schemas.openxmlformats.org/markup-compatibility/2006" xmlns:aink="http://schemas.microsoft.com/office/drawing/2016/ink" xmlns:am3d="http://schemas.microsoft.com/office/drawing/2017/model3d" xmlns:o="urn:schemas-microsoft-com:office:office" xmlns:oel="http://schemas.microsoft.com/office/2019/extlst" xmlns:r="http://schemas.openxmlformats.org/officeDocument/2006/relationships" xmlns:m="http://schemas.openxmlformats.org/officeDocument/2006/math" xmlns:v="urn:schemas-microsoft-com:vml" xmlns:wp14="http://schemas.microsoft.com/office/word/2010/wordprocessingDrawing" xmlns:wp="http://schemas.openxmlformats.org/drawingml/2006/wordprocessingDrawing" xmlns:w10="urn:schemas-microsoft-com:office:word" xmlns:w="http://schemas.openxmlformats.org/wordprocessingml/2006/main" xmlns:w14="http://schemas.microsoft.com/office/word/2010/wordml" xmlns:w15="http://schemas.microsoft.com/office/word/2012/wordml" xmlns:w16cex="http://schemas.microsoft.com/office/word/2018/wordml/cex" xmlns:w16cid="http://schemas.microsoft.com/office/word/2016/wordml/cid" xmlns:w16="http://schemas.microsoft.com/office/word/2018/wordml" xmlns:w16du="http://schemas.microsoft.com/office/word/2023/wordml/word16du" xmlns:w16sdtdh="http://schemas.microsoft.com/office/word/2020/wordml/sdtdatahash" xmlns:w16sdtfl="http://schemas.microsoft.com/office/word/2024/wordml/sdtformatlock" xmlns:w16se="http://schemas.microsoft.com/office/word/2015/wordml/symex" xmlns:wpg="http://schemas.microsoft.com/office/word/2010/wordprocessingGroup" xmlns:wpi="http://schemas.microsoft.com/office/word/2010/wordprocessingInk" xmlns:wne="http://schemas.microsoft.com/office/word/2006/wordml" xmlns:wps="http://schemas.microsoft.com/office/word/2010/wordprocessingShape" mc:Ignorable="w14 w15 w16se w16cid w16 w16cex w16sdtdh w16sdtfl w16du wp14">
   <w:footnote w:type="separator" w:id="-1">
@@ -4350,36 +4197,6 @@
     </w:p>
   </w:footnote>
 </w:footnotes>
-</file>
-
-<file path=word/header1.xml><?xml version="1.0" encoding="utf-8"?>
-<w:hdr xmlns:wpc="http://schemas.microsoft.com/office/word/2010/wordprocessingCanvas" xmlns:cx="http://schemas.microsoft.com/office/drawing/2014/chartex" xmlns:cx1="http://schemas.microsoft.com/office/drawing/2015/9/8/chartex" xmlns:cx2="http://schemas.microsoft.com/office/drawing/2015/10/21/chartex" xmlns:cx3="http://schemas.microsoft.com/office/drawing/2016/5/9/chartex" xmlns:cx4="http://schemas.microsoft.com/office/drawing/2016/5/10/chartex" xmlns:cx5="http://schemas.microsoft.com/office/drawing/2016/5/11/chartex" xmlns:cx6="http://schemas.microsoft.com/office/drawing/2016/5/12/chartex" xmlns:cx7="http://schemas.microsoft.com/office/drawing/2016/5/13/chartex" xmlns:cx8="http://schemas.microsoft.com/office/drawing/2016/5/14/chartex" xmlns:mc="http://schemas.openxmlformats.org/markup-compatibility/2006" xmlns:aink="http://schemas.microsoft.com/office/drawing/2016/ink" xmlns:am3d="http://schemas.microsoft.com/office/drawing/2017/model3d" xmlns:o="urn:schemas-microsoft-com:office:office" xmlns:oel="http://schemas.microsoft.com/office/2019/extlst" xmlns:r="http://schemas.openxmlformats.org/officeDocument/2006/relationships" xmlns:m="http://schemas.openxmlformats.org/officeDocument/2006/math" xmlns:v="urn:schemas-microsoft-com:vml" xmlns:wp14="http://schemas.microsoft.com/office/word/2010/wordprocessingDrawing" xmlns:wp="http://schemas.openxmlformats.org/drawingml/2006/wordprocessingDrawing" xmlns:w10="urn:schemas-microsoft-com:office:word" xmlns:w="http://schemas.openxmlformats.org/wordprocessingml/2006/main" xmlns:w14="http://schemas.microsoft.com/office/word/2010/wordml" xmlns:w15="http://schemas.microsoft.com/office/word/2012/wordml" xmlns:w16cex="http://schemas.microsoft.com/office/word/2018/wordml/cex" xmlns:w16cid="http://schemas.microsoft.com/office/word/2016/wordml/cid" xmlns:w16="http://schemas.microsoft.com/office/word/2018/wordml" xmlns:w16du="http://schemas.microsoft.com/office/word/2023/wordml/word16du" xmlns:w16sdtdh="http://schemas.microsoft.com/office/word/2020/wordml/sdtdatahash" xmlns:w16sdtfl="http://schemas.microsoft.com/office/word/2024/wordml/sdtformatlock" xmlns:w16se="http://schemas.microsoft.com/office/word/2015/wordml/symex" xmlns:wpg="http://schemas.microsoft.com/office/word/2010/wordprocessingGroup" xmlns:wpi="http://schemas.microsoft.com/office/word/2010/wordprocessingInk" xmlns:wne="http://schemas.microsoft.com/office/word/2006/wordml" xmlns:wps="http://schemas.microsoft.com/office/word/2010/wordprocessingShape" mc:Ignorable="w14 w15 w16se w16cid w16 w16cex w16sdtdh w16sdtfl w16du wp14">
-  <w:p>
-    <w:pPr>
-      <w:pStyle w:val="Encabezado"/>
-    </w:pPr>
-  </w:p>
-</w:hdr>
-</file>
-
-<file path=word/header2.xml><?xml version="1.0" encoding="utf-8"?>
-<w:hdr xmlns:wpc="http://schemas.microsoft.com/office/word/2010/wordprocessingCanvas" xmlns:cx="http://schemas.microsoft.com/office/drawing/2014/chartex" xmlns:cx1="http://schemas.microsoft.com/office/drawing/2015/9/8/chartex" xmlns:cx2="http://schemas.microsoft.com/office/drawing/2015/10/21/chartex" xmlns:cx3="http://schemas.microsoft.com/office/drawing/2016/5/9/chartex" xmlns:cx4="http://schemas.microsoft.com/office/drawing/2016/5/10/chartex" xmlns:cx5="http://schemas.microsoft.com/office/drawing/2016/5/11/chartex" xmlns:cx6="http://schemas.microsoft.com/office/drawing/2016/5/12/chartex" xmlns:cx7="http://schemas.microsoft.com/office/drawing/2016/5/13/chartex" xmlns:cx8="http://schemas.microsoft.com/office/drawing/2016/5/14/chartex" xmlns:mc="http://schemas.openxmlformats.org/markup-compatibility/2006" xmlns:aink="http://schemas.microsoft.com/office/drawing/2016/ink" xmlns:am3d="http://schemas.microsoft.com/office/drawing/2017/model3d" xmlns:o="urn:schemas-microsoft-com:office:office" xmlns:oel="http://schemas.microsoft.com/office/2019/extlst" xmlns:r="http://schemas.openxmlformats.org/officeDocument/2006/relationships" xmlns:m="http://schemas.openxmlformats.org/officeDocument/2006/math" xmlns:v="urn:schemas-microsoft-com:vml" xmlns:wp14="http://schemas.microsoft.com/office/word/2010/wordprocessingDrawing" xmlns:wp="http://schemas.openxmlformats.org/drawingml/2006/wordprocessingDrawing" xmlns:w10="urn:schemas-microsoft-com:office:word" xmlns:w="http://schemas.openxmlformats.org/wordprocessingml/2006/main" xmlns:w14="http://schemas.microsoft.com/office/word/2010/wordml" xmlns:w15="http://schemas.microsoft.com/office/word/2012/wordml" xmlns:w16cex="http://schemas.microsoft.com/office/word/2018/wordml/cex" xmlns:w16cid="http://schemas.microsoft.com/office/word/2016/wordml/cid" xmlns:w16="http://schemas.microsoft.com/office/word/2018/wordml" xmlns:w16du="http://schemas.microsoft.com/office/word/2023/wordml/word16du" xmlns:w16sdtdh="http://schemas.microsoft.com/office/word/2020/wordml/sdtdatahash" xmlns:w16sdtfl="http://schemas.microsoft.com/office/word/2024/wordml/sdtformatlock" xmlns:w16se="http://schemas.microsoft.com/office/word/2015/wordml/symex" xmlns:wpg="http://schemas.microsoft.com/office/word/2010/wordprocessingGroup" xmlns:wpi="http://schemas.microsoft.com/office/word/2010/wordprocessingInk" xmlns:wne="http://schemas.microsoft.com/office/word/2006/wordml" xmlns:wps="http://schemas.microsoft.com/office/word/2010/wordprocessingShape" mc:Ignorable="w14 w15 w16se w16cid w16 w16cex w16sdtdh w16sdtfl w16du wp14">
-  <w:p>
-    <w:pPr>
-      <w:pStyle w:val="Encabezado"/>
-    </w:pPr>
-  </w:p>
-</w:hdr>
-</file>
-
-<file path=word/header3.xml><?xml version="1.0" encoding="utf-8"?>
-<w:hdr xmlns:wpc="http://schemas.microsoft.com/office/word/2010/wordprocessingCanvas" xmlns:cx="http://schemas.microsoft.com/office/drawing/2014/chartex" xmlns:cx1="http://schemas.microsoft.com/office/drawing/2015/9/8/chartex" xmlns:cx2="http://schemas.microsoft.com/office/drawing/2015/10/21/chartex" xmlns:cx3="http://schemas.microsoft.com/office/drawing/2016/5/9/chartex" xmlns:cx4="http://schemas.microsoft.com/office/drawing/2016/5/10/chartex" xmlns:cx5="http://schemas.microsoft.com/office/drawing/2016/5/11/chartex" xmlns:cx6="http://schemas.microsoft.com/office/drawing/2016/5/12/chartex" xmlns:cx7="http://schemas.microsoft.com/office/drawing/2016/5/13/chartex" xmlns:cx8="http://schemas.microsoft.com/office/drawing/2016/5/14/chartex" xmlns:mc="http://schemas.openxmlformats.org/markup-compatibility/2006" xmlns:aink="http://schemas.microsoft.com/office/drawing/2016/ink" xmlns:am3d="http://schemas.microsoft.com/office/drawing/2017/model3d" xmlns:o="urn:schemas-microsoft-com:office:office" xmlns:oel="http://schemas.microsoft.com/office/2019/extlst" xmlns:r="http://schemas.openxmlformats.org/officeDocument/2006/relationships" xmlns:m="http://schemas.openxmlformats.org/officeDocument/2006/math" xmlns:v="urn:schemas-microsoft-com:vml" xmlns:wp14="http://schemas.microsoft.com/office/word/2010/wordprocessingDrawing" xmlns:wp="http://schemas.openxmlformats.org/drawingml/2006/wordprocessingDrawing" xmlns:w10="urn:schemas-microsoft-com:office:word" xmlns:w="http://schemas.openxmlformats.org/wordprocessingml/2006/main" xmlns:w14="http://schemas.microsoft.com/office/word/2010/wordml" xmlns:w15="http://schemas.microsoft.com/office/word/2012/wordml" xmlns:w16cex="http://schemas.microsoft.com/office/word/2018/wordml/cex" xmlns:w16cid="http://schemas.microsoft.com/office/word/2016/wordml/cid" xmlns:w16="http://schemas.microsoft.com/office/word/2018/wordml" xmlns:w16du="http://schemas.microsoft.com/office/word/2023/wordml/word16du" xmlns:w16sdtdh="http://schemas.microsoft.com/office/word/2020/wordml/sdtdatahash" xmlns:w16sdtfl="http://schemas.microsoft.com/office/word/2024/wordml/sdtformatlock" xmlns:w16se="http://schemas.microsoft.com/office/word/2015/wordml/symex" xmlns:wpg="http://schemas.microsoft.com/office/word/2010/wordprocessingGroup" xmlns:wpi="http://schemas.microsoft.com/office/word/2010/wordprocessingInk" xmlns:wne="http://schemas.microsoft.com/office/word/2006/wordml" xmlns:wps="http://schemas.microsoft.com/office/word/2010/wordprocessingShape" mc:Ignorable="w14 w15 w16se w16cid w16 w16cex w16sdtdh w16sdtfl w16du wp14">
-  <w:p>
-    <w:pPr>
-      <w:pStyle w:val="Encabezado"/>
-    </w:pPr>
-  </w:p>
-</w:hdr>
 </file>
 
 <file path=word/styles.xml><?xml version="1.0" encoding="utf-8"?>

</xml_diff>

<commit_message>
feat: actualizar plantilla pesaje ticket
</commit_message>
<xml_diff>
--- a/pesaje/analytica/Report/PrintTicket.docx
+++ b/pesaje/analytica/Report/PrintTicket.docx
@@ -697,7 +697,6 @@
                 <w:szCs w:val="16"/>
               </w:rPr>
             </w:pPr>
-            <w:proofErr w:type="gramStart"/>
             <w:r>
               <w:rPr>
                 <w:rFonts w:ascii="Arial" w:hAnsi="Arial"/>
@@ -707,33 +706,8 @@
                 <w:szCs w:val="16"/>
                 <w:lang w:val="es-PE"/>
               </w:rPr>
-              <w:t>Ticket</w:t>
-            </w:r>
-            <w:proofErr w:type="gramEnd"/>
-            <w:r>
-              <w:rPr>
-                <w:rFonts w:ascii="Arial" w:hAnsi="Arial"/>
-                <w:b/>
-                <w:color w:val="000000" w:themeColor="text1"/>
-                <w:sz w:val="16"/>
-                <w:szCs w:val="16"/>
-                <w:lang w:val="es-PE"/>
-              </w:rPr>
-              <w:t xml:space="preserve"> de Pesaje </w:t>
-            </w:r>
-            <w:proofErr w:type="spellStart"/>
-            <w:r>
-              <w:rPr>
-                <w:rFonts w:ascii="Arial" w:hAnsi="Arial"/>
-                <w:b/>
-                <w:color w:val="000000" w:themeColor="text1"/>
-                <w:sz w:val="16"/>
-                <w:szCs w:val="16"/>
-                <w:lang w:val="es-PE"/>
-              </w:rPr>
-              <w:t>N°</w:t>
-            </w:r>
-            <w:proofErr w:type="spellEnd"/>
+              <w:t>Ticket de Pesaje N°</w:t>
+            </w:r>
           </w:p>
         </w:tc>
         <w:tc>
@@ -1922,7 +1896,6 @@
                 <w:szCs w:val="16"/>
               </w:rPr>
             </w:pPr>
-            <w:proofErr w:type="spellStart"/>
             <w:r>
               <w:rPr>
                 <w:rFonts w:ascii="Arial" w:hAnsi="Arial"/>
@@ -1932,19 +1905,7 @@
                 <w:szCs w:val="16"/>
                 <w:lang w:val="es-PE"/>
               </w:rPr>
-              <w:t>N°</w:t>
-            </w:r>
-            <w:proofErr w:type="spellEnd"/>
-            <w:r>
-              <w:rPr>
-                <w:rFonts w:ascii="Arial" w:hAnsi="Arial"/>
-                <w:b/>
-                <w:color w:val="000000" w:themeColor="text1"/>
-                <w:sz w:val="16"/>
-                <w:szCs w:val="16"/>
-                <w:lang w:val="es-PE"/>
-              </w:rPr>
-              <w:t xml:space="preserve"> Doc / Guia R.</w:t>
+              <w:t>N° Doc / Guia R.</w:t>
             </w:r>
           </w:p>
         </w:tc>
@@ -2301,7 +2262,6 @@
                 <w:szCs w:val="16"/>
               </w:rPr>
             </w:pPr>
-            <w:proofErr w:type="spellStart"/>
             <w:r>
               <w:rPr>
                 <w:rFonts w:ascii="Arial" w:hAnsi="Arial"/>
@@ -2312,7 +2272,6 @@
               </w:rPr>
               <w:t>Producto</w:t>
             </w:r>
-            <w:proofErr w:type="spellEnd"/>
           </w:p>
         </w:tc>
         <w:tc>
@@ -2409,7 +2368,6 @@
                 <w:szCs w:val="16"/>
               </w:rPr>
             </w:pPr>
-            <w:proofErr w:type="spellStart"/>
             <w:r>
               <w:rPr>
                 <w:rFonts w:ascii="Arial" w:hAnsi="Arial"/>
@@ -2420,7 +2378,6 @@
               </w:rPr>
               <w:t>Envase</w:t>
             </w:r>
-            <w:proofErr w:type="spellEnd"/>
           </w:p>
         </w:tc>
         <w:tc>
@@ -2438,7 +2395,6 @@
                 <w:szCs w:val="16"/>
               </w:rPr>
             </w:pPr>
-            <w:proofErr w:type="spellStart"/>
             <w:r>
               <w:rPr>
                 <w:rFonts w:ascii="Arial" w:hAnsi="Arial"/>
@@ -2449,7 +2405,6 @@
               </w:rPr>
               <w:t>Cantidad</w:t>
             </w:r>
-            <w:proofErr w:type="spellEnd"/>
           </w:p>
         </w:tc>
         <w:tc>
@@ -3829,7 +3784,7 @@
                 <w:sz w:val="16"/>
                 <w:szCs w:val="16"/>
               </w:rPr>
-              <w:instrText xml:space="preserve"> MERGEFIELD  guardia  \* MERGEFORMAT </w:instrText>
+              <w:instrText xml:space="preserve"> MERGEFIELD  nombre_guardia  \* MERGEFORMAT </w:instrText>
             </w:r>
             <w:r>
               <w:rPr>
@@ -3850,7 +3805,7 @@
                 <w:sz w:val="16"/>
                 <w:szCs w:val="16"/>
               </w:rPr>
-              <w:t>«guardia»</w:t>
+              <w:t>«nombre_guardia»</w:t>
             </w:r>
             <w:r>
               <w:rPr>
@@ -4016,13 +3971,6 @@
         </w:tc>
       </w:tr>
     </w:tbl>
-    <w:p>
-      <w:pPr>
-        <w:rPr>
-          <w:lang w:val="es-PE"/>
-        </w:rPr>
-      </w:pPr>
-    </w:p>
     <w:p>
       <w:pPr>
         <w:rPr>
@@ -4038,7 +3986,6 @@
           <w:szCs w:val="10"/>
           <w:lang w:eastAsia="es-PE"/>
         </w:rPr>
-        <w:lastRenderedPageBreak/>
         <w:t>Final del formulario</w:t>
       </w:r>
     </w:p>

</xml_diff>